<commit_message>
Agrega introducción, enunciado ampliado y enlace al repositorio
</commit_message>
<xml_diff>
--- a/docs/Primer_Proyecto_Minería.docx
+++ b/docs/Primer_Proyecto_Minería.docx
@@ -18,8 +18,8 @@
           <w:szCs w:val="24"/>
         </w:rPr>
         <w:drawing>
-          <wp:inline distT="114300" distB="114300" distL="114300" distR="114300" wp14:anchorId="2A43BE62" wp14:editId="03EB8182">
-            <wp:extent cx="2987513" cy="1781175"/>
+          <wp:inline distT="114300" distB="114300" distL="114300" distR="114300" wp14:anchorId="6450236D" wp14:editId="716BEBE8">
+            <wp:extent cx="3075150" cy="1781175"/>
             <wp:effectExtent l="0" t="0" r="0" b="0"/>
             <wp:docPr id="1" name="image1.png"/>
             <wp:cNvGraphicFramePr/>
@@ -40,7 +40,7 @@
                   <pic:spPr>
                     <a:xfrm>
                       <a:off x="0" y="0"/>
-                      <a:ext cx="2987513" cy="1781175"/>
+                      <a:ext cx="3075150" cy="1781175"/>
                     </a:xfrm>
                     <a:prstGeom prst="rect">
                       <a:avLst/>
@@ -69,12 +69,14 @@
         <w:spacing w:before="240" w:after="240"/>
         <w:jc w:val="center"/>
         <w:rPr>
-          <w:sz w:val="24"/>
-          <w:szCs w:val="24"/>
-        </w:rPr>
-      </w:pPr>
-      <w:r>
-        <w:rPr>
+          <w:rFonts w:ascii="Times New Roman" w:eastAsia="Times New Roman" w:hAnsi="Times New Roman" w:cs="Times New Roman"/>
+          <w:sz w:val="24"/>
+          <w:szCs w:val="24"/>
+        </w:rPr>
+      </w:pPr>
+      <w:r>
+        <w:rPr>
+          <w:rFonts w:ascii="Times New Roman" w:eastAsia="Times New Roman" w:hAnsi="Times New Roman" w:cs="Times New Roman"/>
           <w:sz w:val="24"/>
           <w:szCs w:val="24"/>
         </w:rPr>
@@ -86,12 +88,14 @@
         <w:spacing w:before="240" w:after="240"/>
         <w:jc w:val="center"/>
         <w:rPr>
-          <w:sz w:val="24"/>
-          <w:szCs w:val="24"/>
-        </w:rPr>
-      </w:pPr>
-      <w:r>
-        <w:rPr>
+          <w:rFonts w:ascii="Times New Roman" w:eastAsia="Times New Roman" w:hAnsi="Times New Roman" w:cs="Times New Roman"/>
+          <w:sz w:val="24"/>
+          <w:szCs w:val="24"/>
+        </w:rPr>
+      </w:pPr>
+      <w:r>
+        <w:rPr>
+          <w:rFonts w:ascii="Times New Roman" w:eastAsia="Times New Roman" w:hAnsi="Times New Roman" w:cs="Times New Roman"/>
           <w:sz w:val="24"/>
           <w:szCs w:val="24"/>
         </w:rPr>
@@ -103,6 +107,7 @@
         <w:spacing w:before="240" w:after="240"/>
         <w:jc w:val="center"/>
         <w:rPr>
+          <w:rFonts w:ascii="Times New Roman" w:eastAsia="Times New Roman" w:hAnsi="Times New Roman" w:cs="Times New Roman"/>
           <w:sz w:val="24"/>
           <w:szCs w:val="24"/>
         </w:rPr>
@@ -113,12 +118,14 @@
         <w:spacing w:before="240" w:after="240"/>
         <w:jc w:val="center"/>
         <w:rPr>
-          <w:sz w:val="24"/>
-          <w:szCs w:val="24"/>
-        </w:rPr>
-      </w:pPr>
-      <w:r>
-        <w:rPr>
+          <w:rFonts w:ascii="Times New Roman" w:eastAsia="Times New Roman" w:hAnsi="Times New Roman" w:cs="Times New Roman"/>
+          <w:sz w:val="24"/>
+          <w:szCs w:val="24"/>
+        </w:rPr>
+      </w:pPr>
+      <w:r>
+        <w:rPr>
+          <w:rFonts w:ascii="Times New Roman" w:eastAsia="Times New Roman" w:hAnsi="Times New Roman" w:cs="Times New Roman"/>
           <w:sz w:val="24"/>
           <w:szCs w:val="24"/>
         </w:rPr>
@@ -130,6 +137,9 @@
         <w:spacing w:before="240" w:after="240"/>
         <w:jc w:val="center"/>
         <w:rPr>
+          <w:rFonts w:ascii="Times New Roman" w:eastAsia="Times New Roman" w:hAnsi="Times New Roman" w:cs="Times New Roman"/>
+          <w:b/>
+          <w:bCs/>
           <w:sz w:val="24"/>
           <w:szCs w:val="24"/>
         </w:rPr>
@@ -140,12 +150,18 @@
         <w:spacing w:before="240" w:after="240"/>
         <w:jc w:val="center"/>
         <w:rPr>
-          <w:sz w:val="24"/>
-          <w:szCs w:val="24"/>
-        </w:rPr>
-      </w:pPr>
-      <w:r>
-        <w:rPr>
+          <w:rFonts w:ascii="Times New Roman" w:eastAsia="Times New Roman" w:hAnsi="Times New Roman" w:cs="Times New Roman"/>
+          <w:b/>
+          <w:bCs/>
+          <w:sz w:val="24"/>
+          <w:szCs w:val="24"/>
+        </w:rPr>
+      </w:pPr>
+      <w:r>
+        <w:rPr>
+          <w:rFonts w:ascii="Times New Roman" w:eastAsia="Times New Roman" w:hAnsi="Times New Roman" w:cs="Times New Roman"/>
+          <w:b/>
+          <w:bCs/>
           <w:sz w:val="24"/>
           <w:szCs w:val="24"/>
         </w:rPr>
@@ -155,32 +171,138 @@
     <w:p>
       <w:pPr>
         <w:spacing w:before="240" w:after="240"/>
-        <w:rPr>
-          <w:sz w:val="24"/>
-          <w:szCs w:val="24"/>
-        </w:rPr>
-      </w:pPr>
-    </w:p>
-    <w:p>
-      <w:pPr>
-        <w:spacing w:before="240" w:after="240"/>
-        <w:rPr>
-          <w:sz w:val="24"/>
-          <w:szCs w:val="24"/>
-        </w:rPr>
-      </w:pPr>
-    </w:p>
-    <w:p>
-      <w:pPr>
-        <w:spacing w:before="240" w:after="240"/>
         <w:jc w:val="center"/>
         <w:rPr>
-          <w:sz w:val="24"/>
-          <w:szCs w:val="24"/>
-        </w:rPr>
-      </w:pPr>
-      <w:r>
-        <w:rPr>
+          <w:rFonts w:ascii="Times New Roman" w:eastAsia="Times New Roman" w:hAnsi="Times New Roman" w:cs="Times New Roman"/>
+          <w:b/>
+          <w:bCs/>
+          <w:sz w:val="24"/>
+          <w:szCs w:val="24"/>
+        </w:rPr>
+      </w:pPr>
+      <w:r>
+        <w:rPr>
+          <w:rFonts w:ascii="Times New Roman" w:eastAsia="Times New Roman" w:hAnsi="Times New Roman" w:cs="Times New Roman"/>
+          <w:b/>
+          <w:bCs/>
+          <w:sz w:val="24"/>
+          <w:szCs w:val="24"/>
+        </w:rPr>
+        <w:t xml:space="preserve">Implementación de un Data </w:t>
+      </w:r>
+      <w:proofErr w:type="spellStart"/>
+      <w:r>
+        <w:rPr>
+          <w:rFonts w:ascii="Times New Roman" w:eastAsia="Times New Roman" w:hAnsi="Times New Roman" w:cs="Times New Roman"/>
+          <w:b/>
+          <w:bCs/>
+          <w:sz w:val="24"/>
+          <w:szCs w:val="24"/>
+        </w:rPr>
+        <w:t>Warehouse</w:t>
+      </w:r>
+      <w:proofErr w:type="spellEnd"/>
+      <w:r>
+        <w:rPr>
+          <w:rFonts w:ascii="Times New Roman" w:eastAsia="Times New Roman" w:hAnsi="Times New Roman" w:cs="Times New Roman"/>
+          <w:b/>
+          <w:bCs/>
+          <w:sz w:val="24"/>
+          <w:szCs w:val="24"/>
+        </w:rPr>
+        <w:t xml:space="preserve"> en Microsoft Azure</w:t>
+      </w:r>
+    </w:p>
+    <w:p>
+      <w:pPr>
+        <w:spacing w:before="240" w:after="240"/>
+        <w:jc w:val="center"/>
+        <w:rPr>
+          <w:rFonts w:ascii="Times New Roman" w:eastAsia="Times New Roman" w:hAnsi="Times New Roman" w:cs="Times New Roman"/>
+          <w:b/>
+          <w:bCs/>
+          <w:sz w:val="24"/>
+          <w:szCs w:val="24"/>
+        </w:rPr>
+      </w:pPr>
+      <w:r>
+        <w:rPr>
+          <w:rFonts w:ascii="Times New Roman" w:eastAsia="Times New Roman" w:hAnsi="Times New Roman" w:cs="Times New Roman"/>
+          <w:b/>
+          <w:bCs/>
+          <w:sz w:val="24"/>
+          <w:szCs w:val="24"/>
+        </w:rPr>
+        <w:t xml:space="preserve"> para </w:t>
+      </w:r>
+      <w:proofErr w:type="spellStart"/>
+      <w:r>
+        <w:rPr>
+          <w:rFonts w:ascii="Times New Roman" w:eastAsia="Times New Roman" w:hAnsi="Times New Roman" w:cs="Times New Roman"/>
+          <w:b/>
+          <w:bCs/>
+          <w:sz w:val="24"/>
+          <w:szCs w:val="24"/>
+        </w:rPr>
+        <w:t>Invacom</w:t>
+      </w:r>
+      <w:proofErr w:type="spellEnd"/>
+      <w:r>
+        <w:rPr>
+          <w:rFonts w:ascii="Times New Roman" w:eastAsia="Times New Roman" w:hAnsi="Times New Roman" w:cs="Times New Roman"/>
+          <w:b/>
+          <w:bCs/>
+          <w:sz w:val="24"/>
+          <w:szCs w:val="24"/>
+        </w:rPr>
+        <w:t xml:space="preserve"> </w:t>
+      </w:r>
+      <w:proofErr w:type="spellStart"/>
+      <w:r>
+        <w:rPr>
+          <w:rFonts w:ascii="Times New Roman" w:eastAsia="Times New Roman" w:hAnsi="Times New Roman" w:cs="Times New Roman"/>
+          <w:b/>
+          <w:bCs/>
+          <w:sz w:val="24"/>
+          <w:szCs w:val="24"/>
+        </w:rPr>
+        <w:t>Inc</w:t>
+      </w:r>
+      <w:proofErr w:type="spellEnd"/>
+      <w:r>
+        <w:rPr>
+          <w:rFonts w:ascii="Times New Roman" w:eastAsia="Times New Roman" w:hAnsi="Times New Roman" w:cs="Times New Roman"/>
+          <w:b/>
+          <w:bCs/>
+          <w:sz w:val="24"/>
+          <w:szCs w:val="24"/>
+        </w:rPr>
+        <w:t xml:space="preserve"> S.A. </w:t>
+      </w:r>
+    </w:p>
+    <w:p>
+      <w:pPr>
+        <w:spacing w:before="240" w:after="240"/>
+        <w:rPr>
+          <w:rFonts w:ascii="Times New Roman" w:eastAsia="Times New Roman" w:hAnsi="Times New Roman" w:cs="Times New Roman"/>
+          <w:sz w:val="24"/>
+          <w:szCs w:val="24"/>
+        </w:rPr>
+      </w:pPr>
+    </w:p>
+    <w:p>
+      <w:pPr>
+        <w:spacing w:before="240" w:after="240"/>
+        <w:jc w:val="center"/>
+        <w:rPr>
+          <w:rFonts w:ascii="Times New Roman" w:eastAsia="Times New Roman" w:hAnsi="Times New Roman" w:cs="Times New Roman"/>
+          <w:sz w:val="24"/>
+          <w:szCs w:val="24"/>
+        </w:rPr>
+      </w:pPr>
+      <w:r>
+        <w:rPr>
+          <w:rFonts w:ascii="Times New Roman" w:eastAsia="Times New Roman" w:hAnsi="Times New Roman" w:cs="Times New Roman"/>
           <w:sz w:val="24"/>
           <w:szCs w:val="24"/>
         </w:rPr>
@@ -189,6 +311,7 @@
       <w:proofErr w:type="spellStart"/>
       <w:r>
         <w:rPr>
+          <w:rFonts w:ascii="Times New Roman" w:eastAsia="Times New Roman" w:hAnsi="Times New Roman" w:cs="Times New Roman"/>
           <w:sz w:val="24"/>
           <w:szCs w:val="24"/>
         </w:rPr>
@@ -197,6 +320,7 @@
       <w:proofErr w:type="spellEnd"/>
       <w:r>
         <w:rPr>
+          <w:rFonts w:ascii="Times New Roman" w:eastAsia="Times New Roman" w:hAnsi="Times New Roman" w:cs="Times New Roman"/>
           <w:sz w:val="24"/>
           <w:szCs w:val="24"/>
         </w:rPr>
@@ -208,64 +332,242 @@
         <w:spacing w:before="240" w:after="240"/>
         <w:jc w:val="center"/>
         <w:rPr>
-          <w:sz w:val="24"/>
-          <w:szCs w:val="24"/>
-        </w:rPr>
-      </w:pPr>
-      <w:r>
-        <w:rPr>
-          <w:sz w:val="24"/>
-          <w:szCs w:val="24"/>
-        </w:rPr>
-        <w:t xml:space="preserve">Juan Daniel </w:t>
+          <w:rFonts w:ascii="Times New Roman" w:eastAsia="Times New Roman" w:hAnsi="Times New Roman" w:cs="Times New Roman"/>
+          <w:sz w:val="24"/>
+          <w:szCs w:val="24"/>
+        </w:rPr>
+      </w:pPr>
+      <w:r>
+        <w:rPr>
+          <w:rFonts w:ascii="Times New Roman" w:eastAsia="Times New Roman" w:hAnsi="Times New Roman" w:cs="Times New Roman"/>
+          <w:sz w:val="24"/>
+          <w:szCs w:val="24"/>
+        </w:rPr>
+        <w:t xml:space="preserve">Juan Daniel Gómez </w:t>
+      </w:r>
+      <w:proofErr w:type="gramStart"/>
+      <w:r>
+        <w:rPr>
+          <w:rFonts w:ascii="Times New Roman" w:eastAsia="Times New Roman" w:hAnsi="Times New Roman" w:cs="Times New Roman"/>
+          <w:sz w:val="24"/>
+          <w:szCs w:val="24"/>
+        </w:rPr>
+        <w:t>Cubillo  Céd</w:t>
+      </w:r>
+      <w:proofErr w:type="gramEnd"/>
+      <w:r>
+        <w:rPr>
+          <w:rFonts w:ascii="Times New Roman" w:eastAsia="Times New Roman" w:hAnsi="Times New Roman" w:cs="Times New Roman"/>
+          <w:sz w:val="24"/>
+          <w:szCs w:val="24"/>
+        </w:rPr>
+        <w:t xml:space="preserve">. </w:t>
       </w:r>
       <w:proofErr w:type="spellStart"/>
       <w:r>
         <w:rPr>
-          <w:sz w:val="24"/>
-          <w:szCs w:val="24"/>
-        </w:rPr>
-        <w:t>Gomez</w:t>
+          <w:rFonts w:ascii="Times New Roman" w:eastAsia="Times New Roman" w:hAnsi="Times New Roman" w:cs="Times New Roman"/>
+          <w:sz w:val="24"/>
+          <w:szCs w:val="24"/>
+        </w:rPr>
+        <w:t>N°</w:t>
       </w:r>
       <w:proofErr w:type="spellEnd"/>
       <w:r>
         <w:rPr>
-          <w:sz w:val="24"/>
-          <w:szCs w:val="24"/>
-        </w:rPr>
-        <w:t xml:space="preserve"> </w:t>
-      </w:r>
+          <w:rFonts w:ascii="Times New Roman" w:eastAsia="Times New Roman" w:hAnsi="Times New Roman" w:cs="Times New Roman"/>
+          <w:sz w:val="24"/>
+          <w:szCs w:val="24"/>
+        </w:rPr>
+        <w:t xml:space="preserve"> 2 0856 0230</w:t>
+      </w:r>
+    </w:p>
+    <w:p>
+      <w:pPr>
+        <w:spacing w:before="240" w:after="240"/>
+        <w:jc w:val="center"/>
+        <w:rPr>
+          <w:rFonts w:ascii="Times New Roman" w:eastAsia="Times New Roman" w:hAnsi="Times New Roman" w:cs="Times New Roman"/>
+          <w:sz w:val="24"/>
+          <w:szCs w:val="24"/>
+        </w:rPr>
+      </w:pPr>
+      <w:r>
+        <w:rPr>
+          <w:rFonts w:ascii="Times New Roman" w:eastAsia="Times New Roman" w:hAnsi="Times New Roman" w:cs="Times New Roman"/>
+          <w:sz w:val="24"/>
+          <w:szCs w:val="24"/>
+        </w:rPr>
+        <w:t xml:space="preserve">John Alejandro Araya Echeverria </w:t>
+      </w:r>
+      <w:proofErr w:type="spellStart"/>
+      <w:r>
+        <w:rPr>
+          <w:rFonts w:ascii="Times New Roman" w:eastAsia="Times New Roman" w:hAnsi="Times New Roman" w:cs="Times New Roman"/>
+          <w:sz w:val="24"/>
+          <w:szCs w:val="24"/>
+        </w:rPr>
+        <w:t>Céd</w:t>
+      </w:r>
+      <w:proofErr w:type="spellEnd"/>
+      <w:r>
+        <w:rPr>
+          <w:rFonts w:ascii="Times New Roman" w:eastAsia="Times New Roman" w:hAnsi="Times New Roman" w:cs="Times New Roman"/>
+          <w:sz w:val="24"/>
+          <w:szCs w:val="24"/>
+        </w:rPr>
+        <w:t xml:space="preserve">. </w:t>
+      </w:r>
+      <w:proofErr w:type="spellStart"/>
+      <w:r>
+        <w:rPr>
+          <w:rFonts w:ascii="Times New Roman" w:eastAsia="Times New Roman" w:hAnsi="Times New Roman" w:cs="Times New Roman"/>
+          <w:sz w:val="24"/>
+          <w:szCs w:val="24"/>
+        </w:rPr>
+        <w:t>N°</w:t>
+      </w:r>
+      <w:proofErr w:type="spellEnd"/>
+      <w:r>
+        <w:rPr>
+          <w:rFonts w:ascii="Times New Roman" w:eastAsia="Times New Roman" w:hAnsi="Times New Roman" w:cs="Times New Roman"/>
+          <w:sz w:val="24"/>
+          <w:szCs w:val="24"/>
+        </w:rPr>
+        <w:t xml:space="preserve"> 703150582</w:t>
+      </w:r>
+    </w:p>
+    <w:p>
+      <w:pPr>
+        <w:spacing w:before="240" w:after="240"/>
+        <w:jc w:val="center"/>
+        <w:rPr>
+          <w:rFonts w:ascii="Times New Roman" w:eastAsia="Times New Roman" w:hAnsi="Times New Roman" w:cs="Times New Roman"/>
+          <w:sz w:val="24"/>
+          <w:szCs w:val="24"/>
+        </w:rPr>
+      </w:pPr>
+      <w:r>
+        <w:rPr>
+          <w:rFonts w:ascii="Times New Roman" w:eastAsia="Times New Roman" w:hAnsi="Times New Roman" w:cs="Times New Roman"/>
+          <w:sz w:val="24"/>
+          <w:szCs w:val="24"/>
+        </w:rPr>
+        <w:t xml:space="preserve">Ryan Eliecer Vega Solano Céd. </w:t>
+      </w:r>
+      <w:proofErr w:type="spellStart"/>
+      <w:r>
+        <w:rPr>
+          <w:rFonts w:ascii="Times New Roman" w:eastAsia="Times New Roman" w:hAnsi="Times New Roman" w:cs="Times New Roman"/>
+          <w:sz w:val="24"/>
+          <w:szCs w:val="24"/>
+        </w:rPr>
+        <w:t>N°</w:t>
+      </w:r>
+      <w:proofErr w:type="spellEnd"/>
+      <w:r>
+        <w:rPr>
+          <w:rFonts w:ascii="Times New Roman" w:eastAsia="Times New Roman" w:hAnsi="Times New Roman" w:cs="Times New Roman"/>
+          <w:sz w:val="24"/>
+          <w:szCs w:val="24"/>
+        </w:rPr>
+        <w:t xml:space="preserve"> 7 0320 0491</w:t>
+      </w:r>
+    </w:p>
+    <w:p>
+      <w:pPr>
+        <w:spacing w:before="240" w:after="240"/>
+        <w:jc w:val="center"/>
+        <w:rPr>
+          <w:rFonts w:ascii="Times New Roman" w:eastAsia="Times New Roman" w:hAnsi="Times New Roman" w:cs="Times New Roman"/>
+          <w:sz w:val="24"/>
+          <w:szCs w:val="24"/>
+        </w:rPr>
+      </w:pPr>
+    </w:p>
+    <w:p>
+      <w:pPr>
+        <w:spacing w:before="240" w:after="240"/>
+        <w:jc w:val="center"/>
+        <w:rPr>
+          <w:rFonts w:ascii="Times New Roman" w:eastAsia="Times New Roman" w:hAnsi="Times New Roman" w:cs="Times New Roman"/>
+          <w:sz w:val="24"/>
+          <w:szCs w:val="24"/>
+        </w:rPr>
+      </w:pPr>
+      <w:r>
+        <w:rPr>
+          <w:rFonts w:ascii="Times New Roman" w:eastAsia="Times New Roman" w:hAnsi="Times New Roman" w:cs="Times New Roman"/>
+          <w:sz w:val="24"/>
+          <w:szCs w:val="24"/>
+        </w:rPr>
+        <w:t>Curso: Minería de Datos</w:t>
+      </w:r>
+    </w:p>
+    <w:p>
+      <w:pPr>
+        <w:spacing w:before="240" w:after="240"/>
+        <w:jc w:val="center"/>
+        <w:rPr>
+          <w:rFonts w:ascii="Times New Roman" w:eastAsia="Times New Roman" w:hAnsi="Times New Roman" w:cs="Times New Roman"/>
+          <w:sz w:val="24"/>
+          <w:szCs w:val="24"/>
+        </w:rPr>
+      </w:pPr>
+      <w:r>
+        <w:rPr>
+          <w:rFonts w:ascii="Times New Roman" w:eastAsia="Times New Roman" w:hAnsi="Times New Roman" w:cs="Times New Roman"/>
+          <w:sz w:val="24"/>
+          <w:szCs w:val="24"/>
+        </w:rPr>
+        <w:t>Profesor: Freddy Rocha Boza</w:t>
+      </w:r>
+    </w:p>
+    <w:p>
+      <w:pPr>
+        <w:spacing w:before="240" w:after="240"/>
+        <w:jc w:val="center"/>
+        <w:rPr>
+          <w:rFonts w:ascii="Times New Roman" w:eastAsia="Times New Roman" w:hAnsi="Times New Roman" w:cs="Times New Roman"/>
+          <w:sz w:val="24"/>
+          <w:szCs w:val="24"/>
+        </w:rPr>
+      </w:pPr>
       <w:proofErr w:type="gramStart"/>
       <w:r>
         <w:rPr>
-          <w:sz w:val="24"/>
-          <w:szCs w:val="24"/>
-        </w:rPr>
-        <w:t>Cubillo  Céd</w:t>
+          <w:rFonts w:ascii="Times New Roman" w:eastAsia="Times New Roman" w:hAnsi="Times New Roman" w:cs="Times New Roman"/>
+          <w:sz w:val="24"/>
+          <w:szCs w:val="24"/>
+        </w:rPr>
+        <w:t>Link</w:t>
       </w:r>
       <w:proofErr w:type="gramEnd"/>
       <w:r>
         <w:rPr>
-          <w:sz w:val="24"/>
-          <w:szCs w:val="24"/>
-        </w:rPr>
-        <w:t xml:space="preserve">. </w:t>
+          <w:rFonts w:ascii="Times New Roman" w:eastAsia="Times New Roman" w:hAnsi="Times New Roman" w:cs="Times New Roman"/>
+          <w:sz w:val="24"/>
+          <w:szCs w:val="24"/>
+        </w:rPr>
+        <w:t xml:space="preserve"> del repositorio a </w:t>
       </w:r>
       <w:proofErr w:type="spellStart"/>
       <w:r>
         <w:rPr>
-          <w:sz w:val="24"/>
-          <w:szCs w:val="24"/>
-        </w:rPr>
-        <w:t>N°</w:t>
+          <w:rFonts w:ascii="Times New Roman" w:eastAsia="Times New Roman" w:hAnsi="Times New Roman" w:cs="Times New Roman"/>
+          <w:sz w:val="24"/>
+          <w:szCs w:val="24"/>
+        </w:rPr>
+        <w:t>git</w:t>
       </w:r>
       <w:proofErr w:type="spellEnd"/>
       <w:r>
         <w:rPr>
-          <w:sz w:val="24"/>
-          <w:szCs w:val="24"/>
-        </w:rPr>
-        <w:t xml:space="preserve"> 208560230</w:t>
+          <w:rFonts w:ascii="Times New Roman" w:eastAsia="Times New Roman" w:hAnsi="Times New Roman" w:cs="Times New Roman"/>
+          <w:sz w:val="24"/>
+          <w:szCs w:val="24"/>
+        </w:rPr>
+        <w:t xml:space="preserve">: </w:t>
       </w:r>
     </w:p>
     <w:p>
@@ -273,160 +575,25 @@
         <w:spacing w:before="240" w:after="240"/>
         <w:jc w:val="center"/>
         <w:rPr>
-          <w:sz w:val="24"/>
-          <w:szCs w:val="24"/>
-        </w:rPr>
-      </w:pPr>
-      <w:r>
-        <w:rPr>
-          <w:sz w:val="24"/>
-          <w:szCs w:val="24"/>
-        </w:rPr>
-        <w:t xml:space="preserve">John Alejandro Araya Echeverria </w:t>
-      </w:r>
-      <w:proofErr w:type="spellStart"/>
-      <w:r>
-        <w:rPr>
-          <w:sz w:val="24"/>
-          <w:szCs w:val="24"/>
-        </w:rPr>
-        <w:t>Céd</w:t>
-      </w:r>
-      <w:proofErr w:type="spellEnd"/>
-      <w:r>
-        <w:rPr>
-          <w:sz w:val="24"/>
-          <w:szCs w:val="24"/>
-        </w:rPr>
-        <w:t xml:space="preserve">. </w:t>
-      </w:r>
-      <w:proofErr w:type="spellStart"/>
-      <w:r>
-        <w:rPr>
-          <w:sz w:val="24"/>
-          <w:szCs w:val="24"/>
-        </w:rPr>
-        <w:t>N°</w:t>
-      </w:r>
-      <w:proofErr w:type="spellEnd"/>
-      <w:r>
-        <w:rPr>
-          <w:sz w:val="24"/>
-          <w:szCs w:val="24"/>
-        </w:rPr>
-        <w:t xml:space="preserve"> 703150582</w:t>
-      </w:r>
-    </w:p>
-    <w:p>
-      <w:pPr>
-        <w:spacing w:before="240" w:after="240"/>
-        <w:jc w:val="center"/>
-        <w:rPr>
-          <w:sz w:val="24"/>
-          <w:szCs w:val="24"/>
-        </w:rPr>
-      </w:pPr>
-      <w:r>
-        <w:rPr>
-          <w:sz w:val="24"/>
-          <w:szCs w:val="24"/>
-        </w:rPr>
-        <w:t xml:space="preserve">Ryan Eliecer Vega Solano Céd. </w:t>
-      </w:r>
-      <w:proofErr w:type="spellStart"/>
-      <w:r>
-        <w:rPr>
-          <w:sz w:val="24"/>
-          <w:szCs w:val="24"/>
-        </w:rPr>
-        <w:t>N°</w:t>
-      </w:r>
-      <w:proofErr w:type="spellEnd"/>
-      <w:r>
-        <w:rPr>
-          <w:sz w:val="24"/>
-          <w:szCs w:val="24"/>
-        </w:rPr>
-        <w:t xml:space="preserve"> 7 0320 0491</w:t>
-      </w:r>
-    </w:p>
-    <w:p>
-      <w:pPr>
-        <w:spacing w:before="240" w:after="240"/>
-        <w:jc w:val="center"/>
-        <w:rPr>
-          <w:sz w:val="24"/>
-          <w:szCs w:val="24"/>
-        </w:rPr>
-      </w:pPr>
-    </w:p>
-    <w:p>
-      <w:pPr>
-        <w:spacing w:before="240" w:after="240"/>
-        <w:jc w:val="center"/>
-        <w:rPr>
-          <w:sz w:val="24"/>
-          <w:szCs w:val="24"/>
-        </w:rPr>
-      </w:pPr>
-      <w:r>
-        <w:rPr>
-          <w:sz w:val="24"/>
-          <w:szCs w:val="24"/>
-        </w:rPr>
-        <w:t>Minería de Datos</w:t>
-      </w:r>
-    </w:p>
-    <w:p>
-      <w:pPr>
-        <w:spacing w:before="240" w:after="240"/>
-        <w:jc w:val="center"/>
-        <w:rPr>
-          <w:sz w:val="24"/>
-          <w:szCs w:val="24"/>
-        </w:rPr>
-      </w:pPr>
-    </w:p>
-    <w:p>
-      <w:pPr>
-        <w:spacing w:before="240" w:after="240"/>
-        <w:jc w:val="center"/>
-        <w:rPr>
-          <w:sz w:val="24"/>
-          <w:szCs w:val="24"/>
-        </w:rPr>
-      </w:pPr>
-      <w:r>
-        <w:rPr>
-          <w:sz w:val="24"/>
-          <w:szCs w:val="24"/>
-        </w:rPr>
-        <w:t>2026</w:t>
-      </w:r>
-    </w:p>
-    <w:p>
-      <w:pPr>
-        <w:spacing w:before="240" w:after="240"/>
-        <w:jc w:val="center"/>
-        <w:rPr>
-          <w:sz w:val="24"/>
-          <w:szCs w:val="24"/>
-        </w:rPr>
-      </w:pPr>
-    </w:p>
-    <w:p>
-      <w:pPr>
-        <w:spacing w:before="240" w:after="240"/>
-        <w:jc w:val="center"/>
-        <w:rPr>
-          <w:sz w:val="24"/>
-          <w:szCs w:val="24"/>
-        </w:rPr>
-      </w:pPr>
+          <w:rFonts w:ascii="Times New Roman" w:eastAsia="Times New Roman" w:hAnsi="Times New Roman" w:cs="Times New Roman"/>
+          <w:sz w:val="24"/>
+          <w:szCs w:val="24"/>
+        </w:rPr>
+      </w:pPr>
+      <w:r>
+        <w:rPr>
+          <w:rFonts w:ascii="Times New Roman" w:eastAsia="Times New Roman" w:hAnsi="Times New Roman" w:cs="Times New Roman"/>
+          <w:b/>
+          <w:bCs/>
+          <w:sz w:val="24"/>
+          <w:szCs w:val="24"/>
+        </w:rPr>
+        <w:t>Noviembre 2026</w:t>
+      </w:r>
     </w:p>
     <w:sdt>
       <w:sdtPr>
-        <w:id w:val="1335578261"/>
+        <w:id w:val="-147288852"/>
         <w:docPartObj>
           <w:docPartGallery w:val="Table of Contents"/>
           <w:docPartUnique/>
@@ -434,33 +601,30 @@
       </w:sdtPr>
       <w:sdtEndPr>
         <w:rPr>
-          <w:rFonts w:ascii="Arial" w:eastAsia="Arial" w:hAnsi="Arial" w:cs="Arial"/>
           <w:b/>
           <w:bCs/>
           <w:noProof/>
-          <w:color w:val="auto"/>
-          <w:sz w:val="22"/>
-          <w:szCs w:val="22"/>
-          <w:lang w:val="es-419"/>
         </w:rPr>
       </w:sdtEndPr>
       <w:sdtContent>
         <w:p>
           <w:pPr>
-            <w:pStyle w:val="TOCHeading"/>
+            <w:spacing w:before="240" w:after="240"/>
             <w:rPr>
-              <w:rFonts w:ascii="Arial" w:hAnsi="Arial" w:cs="Arial"/>
+              <w:rFonts w:ascii="Times New Roman" w:eastAsia="Times New Roman" w:hAnsi="Times New Roman" w:cs="Times New Roman"/>
               <w:b/>
               <w:bCs/>
+              <w:color w:val="002060"/>
               <w:sz w:val="24"/>
               <w:szCs w:val="24"/>
             </w:rPr>
           </w:pPr>
           <w:r>
             <w:rPr>
-              <w:rFonts w:ascii="Arial" w:hAnsi="Arial" w:cs="Arial"/>
+              <w:rFonts w:ascii="Times New Roman" w:eastAsia="Times New Roman" w:hAnsi="Times New Roman" w:cs="Times New Roman"/>
               <w:b/>
               <w:bCs/>
+              <w:color w:val="002060"/>
               <w:sz w:val="24"/>
               <w:szCs w:val="24"/>
             </w:rPr>
@@ -469,20 +633,12 @@
         </w:p>
         <w:p>
           <w:pPr>
-            <w:rPr>
-              <w:sz w:val="24"/>
-              <w:szCs w:val="24"/>
-              <w:lang w:val="en-US"/>
-            </w:rPr>
-          </w:pPr>
-        </w:p>
-        <w:p>
-          <w:pPr>
             <w:pStyle w:val="TOC1"/>
             <w:tabs>
               <w:tab w:val="right" w:leader="dot" w:pos="9019"/>
             </w:tabs>
             <w:rPr>
+              <w:rFonts w:ascii="Times New Roman" w:hAnsi="Times New Roman" w:cs="Times New Roman"/>
               <w:noProof/>
               <w:sz w:val="24"/>
               <w:szCs w:val="24"/>
@@ -490,6 +646,7 @@
           </w:pPr>
           <w:r>
             <w:rPr>
+              <w:rFonts w:ascii="Times New Roman" w:hAnsi="Times New Roman" w:cs="Times New Roman"/>
               <w:sz w:val="24"/>
               <w:szCs w:val="24"/>
             </w:rPr>
@@ -497,33 +654,36 @@
           </w:r>
           <w:r>
             <w:rPr>
+              <w:rFonts w:ascii="Times New Roman" w:hAnsi="Times New Roman" w:cs="Times New Roman"/>
               <w:sz w:val="24"/>
               <w:szCs w:val="24"/>
-              <w:lang w:val="en-US"/>
             </w:rPr>
             <w:instrText xml:space="preserve"> TOC \o "1-3" \h \z \u </w:instrText>
           </w:r>
           <w:r>
             <w:rPr>
+              <w:rFonts w:ascii="Times New Roman" w:hAnsi="Times New Roman" w:cs="Times New Roman"/>
               <w:sz w:val="24"/>
               <w:szCs w:val="24"/>
             </w:rPr>
             <w:fldChar w:fldCharType="separate"/>
           </w:r>
-          <w:hyperlink w:anchor="_Toc243925040" w:history="1">
+          <w:hyperlink w:anchor="_Toc244292535" w:history="1">
             <w:r>
               <w:rPr>
                 <w:rStyle w:val="Hyperlink"/>
+                <w:rFonts w:ascii="Times New Roman" w:hAnsi="Times New Roman" w:cs="Times New Roman"/>
                 <w:b/>
                 <w:bCs/>
                 <w:noProof/>
                 <w:sz w:val="24"/>
                 <w:szCs w:val="24"/>
               </w:rPr>
-              <w:t>Enunciado del problema</w:t>
-            </w:r>
-            <w:r>
-              <w:rPr>
+              <w:t>Introducción</w:t>
+            </w:r>
+            <w:r>
+              <w:rPr>
+                <w:rFonts w:ascii="Times New Roman" w:hAnsi="Times New Roman" w:cs="Times New Roman"/>
                 <w:noProof/>
                 <w:webHidden/>
                 <w:sz w:val="24"/>
@@ -533,6 +693,7 @@
             </w:r>
             <w:r>
               <w:rPr>
+                <w:rFonts w:ascii="Times New Roman" w:hAnsi="Times New Roman" w:cs="Times New Roman"/>
                 <w:noProof/>
                 <w:webHidden/>
                 <w:sz w:val="24"/>
@@ -542,15 +703,17 @@
             </w:r>
             <w:r>
               <w:rPr>
+                <w:rFonts w:ascii="Times New Roman" w:hAnsi="Times New Roman" w:cs="Times New Roman"/>
                 <w:noProof/>
                 <w:webHidden/>
                 <w:sz w:val="24"/>
                 <w:szCs w:val="24"/>
               </w:rPr>
-              <w:instrText xml:space="preserve"> PAGEREF _Toc243925040 \h </w:instrText>
-            </w:r>
-            <w:r>
-              <w:rPr>
+              <w:instrText xml:space="preserve"> PAGEREF _Toc244292535 \h </w:instrText>
+            </w:r>
+            <w:r>
+              <w:rPr>
+                <w:rFonts w:ascii="Times New Roman" w:hAnsi="Times New Roman" w:cs="Times New Roman"/>
                 <w:noProof/>
                 <w:webHidden/>
                 <w:sz w:val="24"/>
@@ -559,6 +722,7 @@
             </w:r>
             <w:r>
               <w:rPr>
+                <w:rFonts w:ascii="Times New Roman" w:hAnsi="Times New Roman" w:cs="Times New Roman"/>
                 <w:noProof/>
                 <w:webHidden/>
                 <w:sz w:val="24"/>
@@ -568,6 +732,7 @@
             </w:r>
             <w:r>
               <w:rPr>
+                <w:rFonts w:ascii="Times New Roman" w:hAnsi="Times New Roman" w:cs="Times New Roman"/>
                 <w:noProof/>
                 <w:webHidden/>
                 <w:sz w:val="24"/>
@@ -577,6 +742,7 @@
             </w:r>
             <w:r>
               <w:rPr>
+                <w:rFonts w:ascii="Times New Roman" w:hAnsi="Times New Roman" w:cs="Times New Roman"/>
                 <w:noProof/>
                 <w:webHidden/>
                 <w:sz w:val="24"/>
@@ -593,25 +759,29 @@
               <w:tab w:val="right" w:leader="dot" w:pos="9019"/>
             </w:tabs>
             <w:rPr>
+              <w:rFonts w:ascii="Times New Roman" w:hAnsi="Times New Roman" w:cs="Times New Roman"/>
               <w:noProof/>
               <w:sz w:val="24"/>
               <w:szCs w:val="24"/>
             </w:rPr>
           </w:pPr>
-          <w:hyperlink w:anchor="_Toc243925041" w:history="1">
+          <w:hyperlink w:anchor="_Toc244292536" w:history="1">
             <w:r>
               <w:rPr>
                 <w:rStyle w:val="Hyperlink"/>
+                <w:rFonts w:ascii="Times New Roman" w:hAnsi="Times New Roman" w:cs="Times New Roman"/>
                 <w:b/>
                 <w:bCs/>
                 <w:noProof/>
                 <w:sz w:val="24"/>
                 <w:szCs w:val="24"/>
-              </w:rPr>
-              <w:t>Objetivo General</w:t>
-            </w:r>
-            <w:r>
-              <w:rPr>
+                <w:lang w:val="es-CR"/>
+              </w:rPr>
+              <w:t>Repositorio del proyecto</w:t>
+            </w:r>
+            <w:r>
+              <w:rPr>
+                <w:rFonts w:ascii="Times New Roman" w:hAnsi="Times New Roman" w:cs="Times New Roman"/>
                 <w:noProof/>
                 <w:webHidden/>
                 <w:sz w:val="24"/>
@@ -621,6 +791,7 @@
             </w:r>
             <w:r>
               <w:rPr>
+                <w:rFonts w:ascii="Times New Roman" w:hAnsi="Times New Roman" w:cs="Times New Roman"/>
                 <w:noProof/>
                 <w:webHidden/>
                 <w:sz w:val="24"/>
@@ -630,15 +801,17 @@
             </w:r>
             <w:r>
               <w:rPr>
+                <w:rFonts w:ascii="Times New Roman" w:hAnsi="Times New Roman" w:cs="Times New Roman"/>
                 <w:noProof/>
                 <w:webHidden/>
                 <w:sz w:val="24"/>
                 <w:szCs w:val="24"/>
               </w:rPr>
-              <w:instrText xml:space="preserve"> PAGEREF _Toc243925041 \h </w:instrText>
-            </w:r>
-            <w:r>
-              <w:rPr>
+              <w:instrText xml:space="preserve"> PAGEREF _Toc244292536 \h </w:instrText>
+            </w:r>
+            <w:r>
+              <w:rPr>
+                <w:rFonts w:ascii="Times New Roman" w:hAnsi="Times New Roman" w:cs="Times New Roman"/>
                 <w:noProof/>
                 <w:webHidden/>
                 <w:sz w:val="24"/>
@@ -647,6 +820,7 @@
             </w:r>
             <w:r>
               <w:rPr>
+                <w:rFonts w:ascii="Times New Roman" w:hAnsi="Times New Roman" w:cs="Times New Roman"/>
                 <w:noProof/>
                 <w:webHidden/>
                 <w:sz w:val="24"/>
@@ -656,6 +830,7 @@
             </w:r>
             <w:r>
               <w:rPr>
+                <w:rFonts w:ascii="Times New Roman" w:hAnsi="Times New Roman" w:cs="Times New Roman"/>
                 <w:noProof/>
                 <w:webHidden/>
                 <w:sz w:val="24"/>
@@ -665,6 +840,7 @@
             </w:r>
             <w:r>
               <w:rPr>
+                <w:rFonts w:ascii="Times New Roman" w:hAnsi="Times New Roman" w:cs="Times New Roman"/>
                 <w:noProof/>
                 <w:webHidden/>
                 <w:sz w:val="24"/>
@@ -681,25 +857,28 @@
               <w:tab w:val="right" w:leader="dot" w:pos="9019"/>
             </w:tabs>
             <w:rPr>
+              <w:rFonts w:ascii="Times New Roman" w:hAnsi="Times New Roman" w:cs="Times New Roman"/>
               <w:noProof/>
               <w:sz w:val="24"/>
               <w:szCs w:val="24"/>
             </w:rPr>
           </w:pPr>
-          <w:hyperlink w:anchor="_Toc243925042" w:history="1">
+          <w:hyperlink w:anchor="_Toc244292537" w:history="1">
             <w:r>
               <w:rPr>
                 <w:rStyle w:val="Hyperlink"/>
+                <w:rFonts w:ascii="Times New Roman" w:hAnsi="Times New Roman" w:cs="Times New Roman"/>
                 <w:b/>
                 <w:bCs/>
                 <w:noProof/>
                 <w:sz w:val="24"/>
                 <w:szCs w:val="24"/>
               </w:rPr>
-              <w:t>Objetivos Específicos</w:t>
-            </w:r>
-            <w:r>
-              <w:rPr>
+              <w:t>Enunciado del problema</w:t>
+            </w:r>
+            <w:r>
+              <w:rPr>
+                <w:rFonts w:ascii="Times New Roman" w:hAnsi="Times New Roman" w:cs="Times New Roman"/>
                 <w:noProof/>
                 <w:webHidden/>
                 <w:sz w:val="24"/>
@@ -709,6 +888,7 @@
             </w:r>
             <w:r>
               <w:rPr>
+                <w:rFonts w:ascii="Times New Roman" w:hAnsi="Times New Roman" w:cs="Times New Roman"/>
                 <w:noProof/>
                 <w:webHidden/>
                 <w:sz w:val="24"/>
@@ -718,15 +898,17 @@
             </w:r>
             <w:r>
               <w:rPr>
+                <w:rFonts w:ascii="Times New Roman" w:hAnsi="Times New Roman" w:cs="Times New Roman"/>
                 <w:noProof/>
                 <w:webHidden/>
                 <w:sz w:val="24"/>
                 <w:szCs w:val="24"/>
               </w:rPr>
-              <w:instrText xml:space="preserve"> PAGEREF _Toc243925042 \h </w:instrText>
-            </w:r>
-            <w:r>
-              <w:rPr>
+              <w:instrText xml:space="preserve"> PAGEREF _Toc244292537 \h </w:instrText>
+            </w:r>
+            <w:r>
+              <w:rPr>
+                <w:rFonts w:ascii="Times New Roman" w:hAnsi="Times New Roman" w:cs="Times New Roman"/>
                 <w:noProof/>
                 <w:webHidden/>
                 <w:sz w:val="24"/>
@@ -735,6 +917,7 @@
             </w:r>
             <w:r>
               <w:rPr>
+                <w:rFonts w:ascii="Times New Roman" w:hAnsi="Times New Roman" w:cs="Times New Roman"/>
                 <w:noProof/>
                 <w:webHidden/>
                 <w:sz w:val="24"/>
@@ -744,15 +927,17 @@
             </w:r>
             <w:r>
               <w:rPr>
+                <w:rFonts w:ascii="Times New Roman" w:hAnsi="Times New Roman" w:cs="Times New Roman"/>
                 <w:noProof/>
                 <w:webHidden/>
                 <w:sz w:val="24"/>
                 <w:szCs w:val="24"/>
               </w:rPr>
-              <w:t>4</w:t>
-            </w:r>
-            <w:r>
-              <w:rPr>
+              <w:t>5</w:t>
+            </w:r>
+            <w:r>
+              <w:rPr>
+                <w:rFonts w:ascii="Times New Roman" w:hAnsi="Times New Roman" w:cs="Times New Roman"/>
                 <w:noProof/>
                 <w:webHidden/>
                 <w:sz w:val="24"/>
@@ -764,12 +949,299 @@
         </w:p>
         <w:p>
           <w:pPr>
+            <w:pStyle w:val="TOC1"/>
+            <w:tabs>
+              <w:tab w:val="right" w:leader="dot" w:pos="9019"/>
+            </w:tabs>
             <w:rPr>
-              <w:lang w:val="en-US"/>
+              <w:rFonts w:ascii="Times New Roman" w:hAnsi="Times New Roman" w:cs="Times New Roman"/>
+              <w:noProof/>
+              <w:sz w:val="24"/>
+              <w:szCs w:val="24"/>
             </w:rPr>
           </w:pPr>
+          <w:hyperlink w:anchor="_Toc244292538" w:history="1">
+            <w:r>
+              <w:rPr>
+                <w:rStyle w:val="Hyperlink"/>
+                <w:rFonts w:ascii="Times New Roman" w:hAnsi="Times New Roman" w:cs="Times New Roman"/>
+                <w:b/>
+                <w:bCs/>
+                <w:noProof/>
+                <w:sz w:val="24"/>
+                <w:szCs w:val="24"/>
+              </w:rPr>
+              <w:t>Objetivo General</w:t>
+            </w:r>
+            <w:r>
+              <w:rPr>
+                <w:rFonts w:ascii="Times New Roman" w:hAnsi="Times New Roman" w:cs="Times New Roman"/>
+                <w:noProof/>
+                <w:webHidden/>
+                <w:sz w:val="24"/>
+                <w:szCs w:val="24"/>
+              </w:rPr>
+              <w:tab/>
+            </w:r>
+            <w:r>
+              <w:rPr>
+                <w:rFonts w:ascii="Times New Roman" w:hAnsi="Times New Roman" w:cs="Times New Roman"/>
+                <w:noProof/>
+                <w:webHidden/>
+                <w:sz w:val="24"/>
+                <w:szCs w:val="24"/>
+              </w:rPr>
+              <w:fldChar w:fldCharType="begin"/>
+            </w:r>
+            <w:r>
+              <w:rPr>
+                <w:rFonts w:ascii="Times New Roman" w:hAnsi="Times New Roman" w:cs="Times New Roman"/>
+                <w:noProof/>
+                <w:webHidden/>
+                <w:sz w:val="24"/>
+                <w:szCs w:val="24"/>
+              </w:rPr>
+              <w:instrText xml:space="preserve"> PAGEREF _Toc244292538 \h </w:instrText>
+            </w:r>
+            <w:r>
+              <w:rPr>
+                <w:rFonts w:ascii="Times New Roman" w:hAnsi="Times New Roman" w:cs="Times New Roman"/>
+                <w:noProof/>
+                <w:webHidden/>
+                <w:sz w:val="24"/>
+                <w:szCs w:val="24"/>
+              </w:rPr>
+            </w:r>
+            <w:r>
+              <w:rPr>
+                <w:rFonts w:ascii="Times New Roman" w:hAnsi="Times New Roman" w:cs="Times New Roman"/>
+                <w:noProof/>
+                <w:webHidden/>
+                <w:sz w:val="24"/>
+                <w:szCs w:val="24"/>
+              </w:rPr>
+              <w:fldChar w:fldCharType="separate"/>
+            </w:r>
+            <w:r>
+              <w:rPr>
+                <w:rFonts w:ascii="Times New Roman" w:hAnsi="Times New Roman" w:cs="Times New Roman"/>
+                <w:noProof/>
+                <w:webHidden/>
+                <w:sz w:val="24"/>
+                <w:szCs w:val="24"/>
+              </w:rPr>
+              <w:t>6</w:t>
+            </w:r>
+            <w:r>
+              <w:rPr>
+                <w:rFonts w:ascii="Times New Roman" w:hAnsi="Times New Roman" w:cs="Times New Roman"/>
+                <w:noProof/>
+                <w:webHidden/>
+                <w:sz w:val="24"/>
+                <w:szCs w:val="24"/>
+              </w:rPr>
+              <w:fldChar w:fldCharType="end"/>
+            </w:r>
+          </w:hyperlink>
+        </w:p>
+        <w:p>
+          <w:pPr>
+            <w:pStyle w:val="TOC1"/>
+            <w:tabs>
+              <w:tab w:val="right" w:leader="dot" w:pos="9019"/>
+            </w:tabs>
+            <w:rPr>
+              <w:rFonts w:ascii="Times New Roman" w:hAnsi="Times New Roman" w:cs="Times New Roman"/>
+              <w:noProof/>
+              <w:sz w:val="24"/>
+              <w:szCs w:val="24"/>
+            </w:rPr>
+          </w:pPr>
+          <w:hyperlink w:anchor="_Toc244292539" w:history="1">
+            <w:r>
+              <w:rPr>
+                <w:rStyle w:val="Hyperlink"/>
+                <w:rFonts w:ascii="Times New Roman" w:hAnsi="Times New Roman" w:cs="Times New Roman"/>
+                <w:b/>
+                <w:bCs/>
+                <w:noProof/>
+                <w:sz w:val="24"/>
+                <w:szCs w:val="24"/>
+              </w:rPr>
+              <w:t>Objetivos Específicos</w:t>
+            </w:r>
+            <w:r>
+              <w:rPr>
+                <w:rFonts w:ascii="Times New Roman" w:hAnsi="Times New Roman" w:cs="Times New Roman"/>
+                <w:noProof/>
+                <w:webHidden/>
+                <w:sz w:val="24"/>
+                <w:szCs w:val="24"/>
+              </w:rPr>
+              <w:tab/>
+            </w:r>
+            <w:r>
+              <w:rPr>
+                <w:rFonts w:ascii="Times New Roman" w:hAnsi="Times New Roman" w:cs="Times New Roman"/>
+                <w:noProof/>
+                <w:webHidden/>
+                <w:sz w:val="24"/>
+                <w:szCs w:val="24"/>
+              </w:rPr>
+              <w:fldChar w:fldCharType="begin"/>
+            </w:r>
+            <w:r>
+              <w:rPr>
+                <w:rFonts w:ascii="Times New Roman" w:hAnsi="Times New Roman" w:cs="Times New Roman"/>
+                <w:noProof/>
+                <w:webHidden/>
+                <w:sz w:val="24"/>
+                <w:szCs w:val="24"/>
+              </w:rPr>
+              <w:instrText xml:space="preserve"> PAGEREF _Toc244292539 \h </w:instrText>
+            </w:r>
+            <w:r>
+              <w:rPr>
+                <w:rFonts w:ascii="Times New Roman" w:hAnsi="Times New Roman" w:cs="Times New Roman"/>
+                <w:noProof/>
+                <w:webHidden/>
+                <w:sz w:val="24"/>
+                <w:szCs w:val="24"/>
+              </w:rPr>
+            </w:r>
+            <w:r>
+              <w:rPr>
+                <w:rFonts w:ascii="Times New Roman" w:hAnsi="Times New Roman" w:cs="Times New Roman"/>
+                <w:noProof/>
+                <w:webHidden/>
+                <w:sz w:val="24"/>
+                <w:szCs w:val="24"/>
+              </w:rPr>
+              <w:fldChar w:fldCharType="separate"/>
+            </w:r>
+            <w:r>
+              <w:rPr>
+                <w:rFonts w:ascii="Times New Roman" w:hAnsi="Times New Roman" w:cs="Times New Roman"/>
+                <w:noProof/>
+                <w:webHidden/>
+                <w:sz w:val="24"/>
+                <w:szCs w:val="24"/>
+              </w:rPr>
+              <w:t>6</w:t>
+            </w:r>
+            <w:r>
+              <w:rPr>
+                <w:rFonts w:ascii="Times New Roman" w:hAnsi="Times New Roman" w:cs="Times New Roman"/>
+                <w:noProof/>
+                <w:webHidden/>
+                <w:sz w:val="24"/>
+                <w:szCs w:val="24"/>
+              </w:rPr>
+              <w:fldChar w:fldCharType="end"/>
+            </w:r>
+          </w:hyperlink>
+        </w:p>
+        <w:p>
+          <w:pPr>
+            <w:pStyle w:val="TOC1"/>
+            <w:tabs>
+              <w:tab w:val="right" w:leader="dot" w:pos="9019"/>
+            </w:tabs>
+            <w:rPr>
+              <w:rFonts w:ascii="Times New Roman" w:hAnsi="Times New Roman" w:cs="Times New Roman"/>
+              <w:noProof/>
+              <w:sz w:val="24"/>
+              <w:szCs w:val="24"/>
+            </w:rPr>
+          </w:pPr>
+          <w:hyperlink w:anchor="_Toc244292540" w:history="1">
+            <w:r>
+              <w:rPr>
+                <w:rStyle w:val="Hyperlink"/>
+                <w:rFonts w:ascii="Times New Roman" w:hAnsi="Times New Roman" w:cs="Times New Roman"/>
+                <w:b/>
+                <w:bCs/>
+                <w:noProof/>
+                <w:sz w:val="24"/>
+                <w:szCs w:val="24"/>
+              </w:rPr>
+              <w:t>Bibliografía</w:t>
+            </w:r>
+            <w:r>
+              <w:rPr>
+                <w:rFonts w:ascii="Times New Roman" w:hAnsi="Times New Roman" w:cs="Times New Roman"/>
+                <w:noProof/>
+                <w:webHidden/>
+                <w:sz w:val="24"/>
+                <w:szCs w:val="24"/>
+              </w:rPr>
+              <w:tab/>
+            </w:r>
+            <w:r>
+              <w:rPr>
+                <w:rFonts w:ascii="Times New Roman" w:hAnsi="Times New Roman" w:cs="Times New Roman"/>
+                <w:noProof/>
+                <w:webHidden/>
+                <w:sz w:val="24"/>
+                <w:szCs w:val="24"/>
+              </w:rPr>
+              <w:fldChar w:fldCharType="begin"/>
+            </w:r>
+            <w:r>
+              <w:rPr>
+                <w:rFonts w:ascii="Times New Roman" w:hAnsi="Times New Roman" w:cs="Times New Roman"/>
+                <w:noProof/>
+                <w:webHidden/>
+                <w:sz w:val="24"/>
+                <w:szCs w:val="24"/>
+              </w:rPr>
+              <w:instrText xml:space="preserve"> PAGEREF _Toc244292540 \h </w:instrText>
+            </w:r>
+            <w:r>
+              <w:rPr>
+                <w:rFonts w:ascii="Times New Roman" w:hAnsi="Times New Roman" w:cs="Times New Roman"/>
+                <w:noProof/>
+                <w:webHidden/>
+                <w:sz w:val="24"/>
+                <w:szCs w:val="24"/>
+              </w:rPr>
+            </w:r>
+            <w:r>
+              <w:rPr>
+                <w:rFonts w:ascii="Times New Roman" w:hAnsi="Times New Roman" w:cs="Times New Roman"/>
+                <w:noProof/>
+                <w:webHidden/>
+                <w:sz w:val="24"/>
+                <w:szCs w:val="24"/>
+              </w:rPr>
+              <w:fldChar w:fldCharType="separate"/>
+            </w:r>
+            <w:r>
+              <w:rPr>
+                <w:rFonts w:ascii="Times New Roman" w:hAnsi="Times New Roman" w:cs="Times New Roman"/>
+                <w:noProof/>
+                <w:webHidden/>
+                <w:sz w:val="24"/>
+                <w:szCs w:val="24"/>
+              </w:rPr>
+              <w:t>7</w:t>
+            </w:r>
+            <w:r>
+              <w:rPr>
+                <w:rFonts w:ascii="Times New Roman" w:hAnsi="Times New Roman" w:cs="Times New Roman"/>
+                <w:noProof/>
+                <w:webHidden/>
+                <w:sz w:val="24"/>
+                <w:szCs w:val="24"/>
+              </w:rPr>
+              <w:fldChar w:fldCharType="end"/>
+            </w:r>
+          </w:hyperlink>
+        </w:p>
+        <w:p>
           <w:r>
             <w:rPr>
+              <w:rFonts w:ascii="Times New Roman" w:hAnsi="Times New Roman" w:cs="Times New Roman"/>
               <w:b/>
               <w:bCs/>
               <w:noProof/>
@@ -784,211 +1256,300 @@
     <w:p>
       <w:pPr>
         <w:spacing w:before="240" w:after="240"/>
-        <w:jc w:val="center"/>
-        <w:rPr>
-          <w:sz w:val="24"/>
-          <w:szCs w:val="24"/>
-          <w:lang w:val="en-US"/>
-        </w:rPr>
-      </w:pPr>
-    </w:p>
-    <w:p>
-      <w:pPr>
-        <w:spacing w:before="240" w:after="240"/>
-        <w:rPr>
-          <w:sz w:val="24"/>
-          <w:szCs w:val="24"/>
-          <w:lang w:val="en-US"/>
-        </w:rPr>
-      </w:pPr>
-    </w:p>
-    <w:p>
-      <w:pPr>
-        <w:spacing w:before="240" w:after="240"/>
-        <w:rPr>
-          <w:sz w:val="24"/>
-          <w:szCs w:val="24"/>
-          <w:lang w:val="en-US"/>
-        </w:rPr>
-      </w:pPr>
-    </w:p>
-    <w:p>
-      <w:pPr>
-        <w:spacing w:before="240" w:after="240"/>
-        <w:rPr>
-          <w:sz w:val="24"/>
-          <w:szCs w:val="24"/>
-          <w:lang w:val="en-US"/>
-        </w:rPr>
-      </w:pPr>
-    </w:p>
-    <w:p>
-      <w:pPr>
-        <w:spacing w:before="240" w:after="240"/>
-        <w:rPr>
-          <w:sz w:val="24"/>
-          <w:szCs w:val="24"/>
-          <w:lang w:val="en-US"/>
-        </w:rPr>
-      </w:pPr>
-    </w:p>
-    <w:p>
-      <w:pPr>
-        <w:spacing w:before="240" w:after="240"/>
-        <w:rPr>
-          <w:sz w:val="24"/>
-          <w:szCs w:val="24"/>
-          <w:lang w:val="en-US"/>
-        </w:rPr>
-      </w:pPr>
-    </w:p>
-    <w:p>
-      <w:pPr>
-        <w:spacing w:before="240" w:after="240"/>
-        <w:rPr>
-          <w:sz w:val="24"/>
-          <w:szCs w:val="24"/>
-          <w:lang w:val="en-US"/>
-        </w:rPr>
-      </w:pPr>
-    </w:p>
-    <w:p>
-      <w:pPr>
-        <w:spacing w:before="240" w:after="240"/>
-        <w:rPr>
-          <w:sz w:val="24"/>
-          <w:szCs w:val="24"/>
-          <w:lang w:val="en-US"/>
-        </w:rPr>
-      </w:pPr>
-    </w:p>
-    <w:p>
-      <w:pPr>
-        <w:spacing w:before="240" w:after="240"/>
-        <w:rPr>
-          <w:sz w:val="24"/>
-          <w:szCs w:val="24"/>
-          <w:lang w:val="en-US"/>
-        </w:rPr>
-      </w:pPr>
-    </w:p>
-    <w:p>
-      <w:pPr>
-        <w:spacing w:before="240" w:after="240"/>
-        <w:rPr>
-          <w:sz w:val="24"/>
-          <w:szCs w:val="24"/>
-          <w:lang w:val="en-US"/>
-        </w:rPr>
-      </w:pPr>
-    </w:p>
-    <w:p>
-      <w:pPr>
-        <w:spacing w:before="240" w:after="240"/>
-        <w:rPr>
-          <w:sz w:val="24"/>
-          <w:szCs w:val="24"/>
-          <w:lang w:val="en-US"/>
-        </w:rPr>
-      </w:pPr>
-    </w:p>
-    <w:p>
-      <w:pPr>
-        <w:spacing w:before="240" w:after="240"/>
-        <w:rPr>
-          <w:sz w:val="24"/>
-          <w:szCs w:val="24"/>
-          <w:lang w:val="en-US"/>
-        </w:rPr>
-      </w:pPr>
-    </w:p>
-    <w:p>
-      <w:pPr>
-        <w:spacing w:before="240" w:after="240"/>
-        <w:rPr>
-          <w:sz w:val="24"/>
-          <w:szCs w:val="24"/>
-          <w:lang w:val="en-US"/>
-        </w:rPr>
-      </w:pPr>
-    </w:p>
-    <w:p>
-      <w:pPr>
-        <w:spacing w:before="240" w:after="240"/>
-        <w:rPr>
-          <w:sz w:val="24"/>
-          <w:szCs w:val="24"/>
-          <w:lang w:val="en-US"/>
-        </w:rPr>
-      </w:pPr>
-    </w:p>
-    <w:p>
-      <w:pPr>
-        <w:spacing w:before="240" w:after="240"/>
-        <w:rPr>
-          <w:sz w:val="24"/>
-          <w:szCs w:val="24"/>
-          <w:lang w:val="en-US"/>
-        </w:rPr>
-      </w:pPr>
-    </w:p>
-    <w:p>
-      <w:pPr>
-        <w:spacing w:before="240" w:after="240"/>
-        <w:rPr>
-          <w:sz w:val="24"/>
-          <w:szCs w:val="24"/>
-          <w:lang w:val="en-US"/>
-        </w:rPr>
-      </w:pPr>
-    </w:p>
-    <w:p>
-      <w:pPr>
-        <w:spacing w:before="240" w:after="240"/>
-        <w:rPr>
-          <w:sz w:val="24"/>
-          <w:szCs w:val="24"/>
-          <w:lang w:val="en-US"/>
-        </w:rPr>
-      </w:pPr>
-    </w:p>
-    <w:p>
-      <w:pPr>
-        <w:spacing w:before="240" w:after="240"/>
-        <w:rPr>
-          <w:sz w:val="24"/>
-          <w:szCs w:val="24"/>
-          <w:lang w:val="en-US"/>
-        </w:rPr>
-      </w:pPr>
-    </w:p>
-    <w:p>
-      <w:pPr>
-        <w:spacing w:before="240" w:after="240"/>
-        <w:rPr>
-          <w:sz w:val="24"/>
-          <w:szCs w:val="24"/>
-          <w:lang w:val="en-US"/>
-        </w:rPr>
-      </w:pPr>
-    </w:p>
-    <w:p>
-      <w:pPr>
-        <w:spacing w:before="240" w:after="240"/>
-        <w:rPr>
-          <w:sz w:val="24"/>
-          <w:szCs w:val="24"/>
-          <w:lang w:val="en-US"/>
-        </w:rPr>
-      </w:pPr>
-    </w:p>
-    <w:p>
-      <w:pPr>
-        <w:spacing w:before="240" w:after="240"/>
-        <w:rPr>
-          <w:sz w:val="24"/>
-          <w:szCs w:val="24"/>
-          <w:lang w:val="en-US"/>
+        <w:rPr>
+          <w:rFonts w:ascii="Times New Roman" w:eastAsia="Times New Roman" w:hAnsi="Times New Roman" w:cs="Times New Roman"/>
+          <w:b/>
+          <w:bCs/>
+          <w:sz w:val="24"/>
+          <w:szCs w:val="24"/>
+        </w:rPr>
+      </w:pPr>
+    </w:p>
+    <w:p>
+      <w:pPr>
+        <w:spacing w:before="240" w:after="240"/>
+        <w:rPr>
+          <w:rFonts w:ascii="Times New Roman" w:eastAsia="Times New Roman" w:hAnsi="Times New Roman" w:cs="Times New Roman"/>
+          <w:b/>
+          <w:bCs/>
+          <w:sz w:val="24"/>
+          <w:szCs w:val="24"/>
+        </w:rPr>
+      </w:pPr>
+    </w:p>
+    <w:p>
+      <w:pPr>
+        <w:spacing w:before="240" w:after="240"/>
+        <w:rPr>
+          <w:rFonts w:ascii="Times New Roman" w:eastAsia="Times New Roman" w:hAnsi="Times New Roman" w:cs="Times New Roman"/>
+          <w:b/>
+          <w:bCs/>
+          <w:sz w:val="24"/>
+          <w:szCs w:val="24"/>
+        </w:rPr>
+      </w:pPr>
+    </w:p>
+    <w:p>
+      <w:pPr>
+        <w:spacing w:before="240" w:after="240"/>
+        <w:rPr>
+          <w:rFonts w:ascii="Times New Roman" w:eastAsia="Times New Roman" w:hAnsi="Times New Roman" w:cs="Times New Roman"/>
+          <w:b/>
+          <w:bCs/>
+          <w:sz w:val="24"/>
+          <w:szCs w:val="24"/>
+        </w:rPr>
+      </w:pPr>
+    </w:p>
+    <w:p>
+      <w:pPr>
+        <w:spacing w:before="240" w:after="240"/>
+        <w:rPr>
+          <w:rFonts w:ascii="Times New Roman" w:eastAsia="Times New Roman" w:hAnsi="Times New Roman" w:cs="Times New Roman"/>
+          <w:b/>
+          <w:bCs/>
+          <w:sz w:val="24"/>
+          <w:szCs w:val="24"/>
+        </w:rPr>
+      </w:pPr>
+    </w:p>
+    <w:p>
+      <w:pPr>
+        <w:spacing w:before="240" w:after="240"/>
+        <w:rPr>
+          <w:rFonts w:ascii="Times New Roman" w:eastAsia="Times New Roman" w:hAnsi="Times New Roman" w:cs="Times New Roman"/>
+          <w:b/>
+          <w:bCs/>
+          <w:sz w:val="24"/>
+          <w:szCs w:val="24"/>
+        </w:rPr>
+      </w:pPr>
+    </w:p>
+    <w:p>
+      <w:pPr>
+        <w:spacing w:before="240" w:after="240"/>
+        <w:rPr>
+          <w:rFonts w:ascii="Times New Roman" w:eastAsia="Times New Roman" w:hAnsi="Times New Roman" w:cs="Times New Roman"/>
+          <w:b/>
+          <w:bCs/>
+          <w:sz w:val="24"/>
+          <w:szCs w:val="24"/>
+        </w:rPr>
+      </w:pPr>
+    </w:p>
+    <w:p>
+      <w:pPr>
+        <w:spacing w:before="240" w:after="240"/>
+        <w:rPr>
+          <w:rFonts w:ascii="Times New Roman" w:eastAsia="Times New Roman" w:hAnsi="Times New Roman" w:cs="Times New Roman"/>
+          <w:b/>
+          <w:bCs/>
+          <w:sz w:val="24"/>
+          <w:szCs w:val="24"/>
+        </w:rPr>
+      </w:pPr>
+    </w:p>
+    <w:p>
+      <w:pPr>
+        <w:spacing w:before="240" w:after="240"/>
+        <w:rPr>
+          <w:rFonts w:ascii="Times New Roman" w:eastAsia="Times New Roman" w:hAnsi="Times New Roman" w:cs="Times New Roman"/>
+          <w:b/>
+          <w:bCs/>
+          <w:sz w:val="24"/>
+          <w:szCs w:val="24"/>
+        </w:rPr>
+      </w:pPr>
+    </w:p>
+    <w:p>
+      <w:pPr>
+        <w:spacing w:before="240" w:after="240"/>
+        <w:rPr>
+          <w:rFonts w:ascii="Times New Roman" w:eastAsia="Times New Roman" w:hAnsi="Times New Roman" w:cs="Times New Roman"/>
+          <w:b/>
+          <w:bCs/>
+          <w:sz w:val="24"/>
+          <w:szCs w:val="24"/>
+        </w:rPr>
+      </w:pPr>
+    </w:p>
+    <w:p>
+      <w:pPr>
+        <w:spacing w:before="240" w:after="240"/>
+        <w:rPr>
+          <w:rFonts w:ascii="Times New Roman" w:eastAsia="Times New Roman" w:hAnsi="Times New Roman" w:cs="Times New Roman"/>
+          <w:b/>
+          <w:bCs/>
+          <w:sz w:val="24"/>
+          <w:szCs w:val="24"/>
+        </w:rPr>
+      </w:pPr>
+    </w:p>
+    <w:p>
+      <w:pPr>
+        <w:spacing w:before="240" w:after="240"/>
+        <w:rPr>
+          <w:rFonts w:ascii="Times New Roman" w:eastAsia="Times New Roman" w:hAnsi="Times New Roman" w:cs="Times New Roman"/>
+          <w:b/>
+          <w:bCs/>
+          <w:sz w:val="24"/>
+          <w:szCs w:val="24"/>
+        </w:rPr>
+      </w:pPr>
+    </w:p>
+    <w:p>
+      <w:pPr>
+        <w:spacing w:before="240" w:after="240"/>
+        <w:rPr>
+          <w:rFonts w:ascii="Times New Roman" w:eastAsia="Times New Roman" w:hAnsi="Times New Roman" w:cs="Times New Roman"/>
+          <w:b/>
+          <w:bCs/>
+          <w:sz w:val="24"/>
+          <w:szCs w:val="24"/>
+        </w:rPr>
+      </w:pPr>
+    </w:p>
+    <w:p>
+      <w:pPr>
+        <w:spacing w:before="240" w:after="240"/>
+        <w:rPr>
+          <w:rFonts w:ascii="Times New Roman" w:eastAsia="Times New Roman" w:hAnsi="Times New Roman" w:cs="Times New Roman"/>
+          <w:b/>
+          <w:bCs/>
+          <w:sz w:val="24"/>
+          <w:szCs w:val="24"/>
+        </w:rPr>
+      </w:pPr>
+    </w:p>
+    <w:p>
+      <w:pPr>
+        <w:spacing w:before="240" w:after="240"/>
+        <w:rPr>
+          <w:rFonts w:ascii="Times New Roman" w:eastAsia="Times New Roman" w:hAnsi="Times New Roman" w:cs="Times New Roman"/>
+          <w:b/>
+          <w:bCs/>
+          <w:sz w:val="24"/>
+          <w:szCs w:val="24"/>
+        </w:rPr>
+      </w:pPr>
+    </w:p>
+    <w:p>
+      <w:pPr>
+        <w:spacing w:before="240" w:after="240"/>
+        <w:rPr>
+          <w:rFonts w:ascii="Times New Roman" w:eastAsia="Times New Roman" w:hAnsi="Times New Roman" w:cs="Times New Roman"/>
+          <w:b/>
+          <w:bCs/>
+          <w:sz w:val="24"/>
+          <w:szCs w:val="24"/>
+        </w:rPr>
+      </w:pPr>
+    </w:p>
+    <w:p>
+      <w:pPr>
+        <w:spacing w:before="240" w:after="240"/>
+        <w:rPr>
+          <w:rFonts w:ascii="Times New Roman" w:eastAsia="Times New Roman" w:hAnsi="Times New Roman" w:cs="Times New Roman"/>
+          <w:b/>
+          <w:bCs/>
+          <w:sz w:val="24"/>
+          <w:szCs w:val="24"/>
+        </w:rPr>
+      </w:pPr>
+    </w:p>
+    <w:p>
+      <w:pPr>
+        <w:spacing w:before="240" w:after="240"/>
+        <w:rPr>
+          <w:rFonts w:ascii="Times New Roman" w:eastAsia="Times New Roman" w:hAnsi="Times New Roman" w:cs="Times New Roman"/>
+          <w:b/>
+          <w:bCs/>
+          <w:sz w:val="24"/>
+          <w:szCs w:val="24"/>
+        </w:rPr>
+      </w:pPr>
+    </w:p>
+    <w:p>
+      <w:pPr>
+        <w:spacing w:before="240" w:after="240"/>
+        <w:rPr>
+          <w:rFonts w:ascii="Times New Roman" w:eastAsia="Times New Roman" w:hAnsi="Times New Roman" w:cs="Times New Roman"/>
+          <w:b/>
+          <w:bCs/>
+          <w:sz w:val="24"/>
+          <w:szCs w:val="24"/>
+        </w:rPr>
+      </w:pPr>
+    </w:p>
+    <w:p>
+      <w:pPr>
+        <w:spacing w:before="240" w:after="240"/>
+        <w:rPr>
+          <w:rFonts w:ascii="Times New Roman" w:eastAsia="Times New Roman" w:hAnsi="Times New Roman" w:cs="Times New Roman"/>
+          <w:b/>
+          <w:bCs/>
+          <w:sz w:val="24"/>
+          <w:szCs w:val="24"/>
+        </w:rPr>
+      </w:pPr>
+    </w:p>
+    <w:p>
+      <w:pPr>
+        <w:spacing w:before="240" w:after="240"/>
+        <w:rPr>
+          <w:rFonts w:ascii="Times New Roman" w:eastAsia="Times New Roman" w:hAnsi="Times New Roman" w:cs="Times New Roman"/>
+          <w:b/>
+          <w:bCs/>
+          <w:sz w:val="24"/>
+          <w:szCs w:val="24"/>
+        </w:rPr>
+      </w:pPr>
+    </w:p>
+    <w:p>
+      <w:pPr>
+        <w:spacing w:before="240" w:after="240"/>
+        <w:rPr>
+          <w:rFonts w:ascii="Times New Roman" w:eastAsia="Times New Roman" w:hAnsi="Times New Roman" w:cs="Times New Roman"/>
+          <w:b/>
+          <w:bCs/>
+          <w:sz w:val="24"/>
+          <w:szCs w:val="24"/>
+        </w:rPr>
+      </w:pPr>
+    </w:p>
+    <w:p>
+      <w:pPr>
+        <w:spacing w:before="240" w:after="240"/>
+        <w:rPr>
+          <w:rFonts w:ascii="Times New Roman" w:eastAsia="Times New Roman" w:hAnsi="Times New Roman" w:cs="Times New Roman"/>
+          <w:b/>
+          <w:bCs/>
+          <w:sz w:val="24"/>
+          <w:szCs w:val="24"/>
+        </w:rPr>
+      </w:pPr>
+    </w:p>
+    <w:p>
+      <w:pPr>
+        <w:spacing w:before="240" w:after="240"/>
+        <w:rPr>
+          <w:rFonts w:ascii="Times New Roman" w:eastAsia="Times New Roman" w:hAnsi="Times New Roman" w:cs="Times New Roman"/>
+          <w:b/>
+          <w:bCs/>
+          <w:sz w:val="24"/>
+          <w:szCs w:val="24"/>
+        </w:rPr>
+      </w:pPr>
+    </w:p>
+    <w:p>
+      <w:pPr>
+        <w:spacing w:before="240" w:after="240"/>
+        <w:rPr>
+          <w:rFonts w:ascii="Times New Roman" w:eastAsia="Times New Roman" w:hAnsi="Times New Roman" w:cs="Times New Roman"/>
+          <w:b/>
+          <w:bCs/>
+          <w:sz w:val="24"/>
+          <w:szCs w:val="24"/>
         </w:rPr>
       </w:pPr>
     </w:p>
@@ -996,32 +1557,677 @@
       <w:pPr>
         <w:pStyle w:val="Heading1"/>
         <w:rPr>
-          <w:b/>
-          <w:bCs/>
-          <w:sz w:val="24"/>
-          <w:szCs w:val="24"/>
-        </w:rPr>
-      </w:pPr>
-      <w:bookmarkStart w:id="0" w:name="_ixbi0uwxh65w" w:colFirst="0" w:colLast="0"/>
-      <w:bookmarkStart w:id="1" w:name="_Toc243925040"/>
+          <w:rFonts w:ascii="Times New Roman" w:hAnsi="Times New Roman" w:cs="Times New Roman"/>
+          <w:b/>
+          <w:bCs/>
+          <w:sz w:val="24"/>
+          <w:szCs w:val="24"/>
+        </w:rPr>
+      </w:pPr>
+      <w:bookmarkStart w:id="0" w:name="_Toc244292535"/>
+      <w:r>
+        <w:rPr>
+          <w:rFonts w:ascii="Times New Roman" w:hAnsi="Times New Roman" w:cs="Times New Roman"/>
+          <w:b/>
+          <w:bCs/>
+          <w:sz w:val="24"/>
+          <w:szCs w:val="24"/>
+        </w:rPr>
+        <w:t>Introducción</w:t>
+      </w:r>
       <w:bookmarkEnd w:id="0"/>
-      <w:r>
-        <w:rPr>
-          <w:b/>
-          <w:bCs/>
-          <w:sz w:val="24"/>
-          <w:szCs w:val="24"/>
-        </w:rPr>
-        <w:lastRenderedPageBreak/>
+    </w:p>
+    <w:p>
+      <w:pPr>
+        <w:spacing w:before="240" w:after="240"/>
+        <w:rPr>
+          <w:rFonts w:ascii="Times New Roman" w:eastAsia="Times New Roman" w:hAnsi="Times New Roman" w:cs="Times New Roman"/>
+          <w:sz w:val="24"/>
+          <w:szCs w:val="24"/>
+        </w:rPr>
+      </w:pPr>
+      <w:r>
+        <w:rPr>
+          <w:rFonts w:ascii="Times New Roman" w:eastAsia="Times New Roman" w:hAnsi="Times New Roman" w:cs="Times New Roman"/>
+          <w:sz w:val="24"/>
+          <w:szCs w:val="24"/>
+        </w:rPr>
+        <w:t>En la actualidad, las organizaciones generan grandes volúmenes de datos producto de sus operaciones diarias; sin embargo, contar con datos no equivale a contar con información útil para la toma de decisiones. Las bases de datos transaccionales están optimizadas para registrar operaciones de forma rápida y consistente, pero no para responder consultas analíticas que requieren integrar, resumir y comparar información a lo largo del tiempo. Para resolver esta limitación surge el</w:t>
+      </w:r>
+      <w:r>
+        <w:rPr>
+          <w:rFonts w:ascii="Times New Roman" w:eastAsia="Times New Roman" w:hAnsi="Times New Roman" w:cs="Times New Roman"/>
+          <w:i/>
+          <w:iCs/>
+          <w:sz w:val="24"/>
+          <w:szCs w:val="24"/>
+        </w:rPr>
+        <w:t xml:space="preserve"> data </w:t>
+      </w:r>
+      <w:proofErr w:type="spellStart"/>
+      <w:r>
+        <w:rPr>
+          <w:rFonts w:ascii="Times New Roman" w:eastAsia="Times New Roman" w:hAnsi="Times New Roman" w:cs="Times New Roman"/>
+          <w:i/>
+          <w:iCs/>
+          <w:sz w:val="24"/>
+          <w:szCs w:val="24"/>
+        </w:rPr>
+        <w:t>warehouse</w:t>
+      </w:r>
+      <w:proofErr w:type="spellEnd"/>
+      <w:r>
+        <w:rPr>
+          <w:rFonts w:ascii="Times New Roman" w:eastAsia="Times New Roman" w:hAnsi="Times New Roman" w:cs="Times New Roman"/>
+          <w:sz w:val="24"/>
+          <w:szCs w:val="24"/>
+        </w:rPr>
+        <w:t>, definido como una colección de datos integrada, orientada a temas, no volátil y variante en el tiempo, que sirve de apoyo a la toma de decisiones (Inmon, 2005).</w:t>
+      </w:r>
+    </w:p>
+    <w:p>
+      <w:pPr>
+        <w:spacing w:before="240" w:after="240"/>
+        <w:rPr>
+          <w:rFonts w:ascii="Times New Roman" w:eastAsia="Times New Roman" w:hAnsi="Times New Roman" w:cs="Times New Roman"/>
+          <w:sz w:val="24"/>
+          <w:szCs w:val="24"/>
+        </w:rPr>
+      </w:pPr>
+      <w:r>
+        <w:rPr>
+          <w:rFonts w:ascii="Times New Roman" w:eastAsia="Times New Roman" w:hAnsi="Times New Roman" w:cs="Times New Roman"/>
+          <w:sz w:val="24"/>
+          <w:szCs w:val="24"/>
+        </w:rPr>
+        <w:t xml:space="preserve">El presente documento describe el diseño e implementación de un </w:t>
+      </w:r>
+      <w:r>
+        <w:rPr>
+          <w:rFonts w:ascii="Times New Roman" w:eastAsia="Times New Roman" w:hAnsi="Times New Roman" w:cs="Times New Roman"/>
+          <w:i/>
+          <w:iCs/>
+          <w:sz w:val="24"/>
+          <w:szCs w:val="24"/>
+        </w:rPr>
+        <w:t xml:space="preserve">data </w:t>
+      </w:r>
+      <w:proofErr w:type="spellStart"/>
+      <w:r>
+        <w:rPr>
+          <w:rFonts w:ascii="Times New Roman" w:eastAsia="Times New Roman" w:hAnsi="Times New Roman" w:cs="Times New Roman"/>
+          <w:i/>
+          <w:iCs/>
+          <w:sz w:val="24"/>
+          <w:szCs w:val="24"/>
+        </w:rPr>
+        <w:t>warehouse</w:t>
+      </w:r>
+      <w:proofErr w:type="spellEnd"/>
+      <w:r>
+        <w:rPr>
+          <w:rFonts w:ascii="Times New Roman" w:eastAsia="Times New Roman" w:hAnsi="Times New Roman" w:cs="Times New Roman"/>
+          <w:sz w:val="24"/>
+          <w:szCs w:val="24"/>
+        </w:rPr>
+        <w:t xml:space="preserve"> para la empresa </w:t>
+      </w:r>
+      <w:proofErr w:type="spellStart"/>
+      <w:r>
+        <w:rPr>
+          <w:rFonts w:ascii="Times New Roman" w:eastAsia="Times New Roman" w:hAnsi="Times New Roman" w:cs="Times New Roman"/>
+          <w:sz w:val="24"/>
+          <w:szCs w:val="24"/>
+        </w:rPr>
+        <w:t>Invacom</w:t>
+      </w:r>
+      <w:proofErr w:type="spellEnd"/>
+      <w:r>
+        <w:rPr>
+          <w:rFonts w:ascii="Times New Roman" w:eastAsia="Times New Roman" w:hAnsi="Times New Roman" w:cs="Times New Roman"/>
+          <w:sz w:val="24"/>
+          <w:szCs w:val="24"/>
+        </w:rPr>
+        <w:t xml:space="preserve"> </w:t>
+      </w:r>
+      <w:proofErr w:type="spellStart"/>
+      <w:r>
+        <w:rPr>
+          <w:rFonts w:ascii="Times New Roman" w:eastAsia="Times New Roman" w:hAnsi="Times New Roman" w:cs="Times New Roman"/>
+          <w:sz w:val="24"/>
+          <w:szCs w:val="24"/>
+        </w:rPr>
+        <w:t>Inc</w:t>
+      </w:r>
+      <w:proofErr w:type="spellEnd"/>
+      <w:r>
+        <w:rPr>
+          <w:rFonts w:ascii="Times New Roman" w:eastAsia="Times New Roman" w:hAnsi="Times New Roman" w:cs="Times New Roman"/>
+          <w:sz w:val="24"/>
+          <w:szCs w:val="24"/>
+        </w:rPr>
+        <w:t xml:space="preserve"> S.A., desarrollado en la plataforma de nube Microsoft Azure. Para ello se aplicó el enfoque de modelado dimensional propuesto por Kimball y Ross (2013), mediante un esquema estrella que organiza la información en tablas de hechos y dimensiones. La integración de los datos se realizó con un proceso de extracción, transformación y carga (ETL) construido en Azure Data Factory, que extrae la información de la base de datos transaccional, la depura y la carga en una base de datos de Azure SQL </w:t>
+      </w:r>
+      <w:proofErr w:type="spellStart"/>
+      <w:r>
+        <w:rPr>
+          <w:rFonts w:ascii="Times New Roman" w:eastAsia="Times New Roman" w:hAnsi="Times New Roman" w:cs="Times New Roman"/>
+          <w:sz w:val="24"/>
+          <w:szCs w:val="24"/>
+        </w:rPr>
+        <w:t>Database</w:t>
+      </w:r>
+      <w:proofErr w:type="spellEnd"/>
+      <w:r>
+        <w:rPr>
+          <w:rFonts w:ascii="Times New Roman" w:eastAsia="Times New Roman" w:hAnsi="Times New Roman" w:cs="Times New Roman"/>
+          <w:sz w:val="24"/>
+          <w:szCs w:val="24"/>
+        </w:rPr>
+        <w:t>.</w:t>
+      </w:r>
+    </w:p>
+    <w:p>
+      <w:pPr>
+        <w:spacing w:before="240" w:after="240"/>
+        <w:rPr>
+          <w:rFonts w:ascii="Times New Roman" w:eastAsia="Times New Roman" w:hAnsi="Times New Roman" w:cs="Times New Roman"/>
+          <w:sz w:val="24"/>
+          <w:szCs w:val="24"/>
+        </w:rPr>
+      </w:pPr>
+      <w:r>
+        <w:rPr>
+          <w:rFonts w:ascii="Times New Roman" w:eastAsia="Times New Roman" w:hAnsi="Times New Roman" w:cs="Times New Roman"/>
+          <w:sz w:val="24"/>
+          <w:szCs w:val="24"/>
+        </w:rPr>
+        <w:t xml:space="preserve">El trabajo se organiza de la siguiente manera: primero se presenta el enunciado del problema y los objetivos del proyecto; luego se describe la solución, que incluye el análisis de las fuentes de datos, la evaluación de su calidad, el modelo dimensional, el proceso ETL, los informes construidos en Excel </w:t>
+      </w:r>
+      <w:r>
+        <w:rPr>
+          <w:rFonts w:ascii="Times New Roman" w:eastAsia="Times New Roman" w:hAnsi="Times New Roman" w:cs="Times New Roman"/>
+          <w:sz w:val="24"/>
+          <w:szCs w:val="24"/>
+        </w:rPr>
+        <w:t>y finalmente</w:t>
+      </w:r>
+      <w:r>
+        <w:rPr>
+          <w:rFonts w:ascii="Times New Roman" w:eastAsia="Times New Roman" w:hAnsi="Times New Roman" w:cs="Times New Roman"/>
+          <w:sz w:val="24"/>
+          <w:szCs w:val="24"/>
+        </w:rPr>
+        <w:t>, se exponen las conclusiones. El desarrollo se gestionó con la metodología ágil Scrum, y el código y las evidencias de avance se encuentran en un repositorio de Git.</w:t>
+      </w:r>
+    </w:p>
+    <w:p>
+      <w:pPr>
+        <w:spacing w:before="240" w:after="240"/>
+        <w:rPr>
+          <w:sz w:val="24"/>
+          <w:szCs w:val="24"/>
+        </w:rPr>
+      </w:pPr>
+      <w:r>
+        <w:rPr>
+          <w:sz w:val="24"/>
+          <w:szCs w:val="24"/>
+        </w:rPr>
+        <w:t xml:space="preserve"> </w:t>
+      </w:r>
+    </w:p>
+    <w:p>
+      <w:pPr>
+        <w:spacing w:before="240" w:after="240"/>
+        <w:rPr>
+          <w:sz w:val="24"/>
+          <w:szCs w:val="24"/>
+        </w:rPr>
+      </w:pPr>
+    </w:p>
+    <w:p>
+      <w:pPr>
+        <w:spacing w:before="240" w:after="240"/>
+        <w:rPr>
+          <w:sz w:val="24"/>
+          <w:szCs w:val="24"/>
+        </w:rPr>
+      </w:pPr>
+    </w:p>
+    <w:p>
+      <w:pPr>
+        <w:spacing w:before="240" w:after="240"/>
+        <w:rPr>
+          <w:sz w:val="24"/>
+          <w:szCs w:val="24"/>
+        </w:rPr>
+      </w:pPr>
+    </w:p>
+    <w:p>
+      <w:pPr>
+        <w:spacing w:before="240" w:after="240"/>
+        <w:rPr>
+          <w:sz w:val="24"/>
+          <w:szCs w:val="24"/>
+        </w:rPr>
+      </w:pPr>
+    </w:p>
+    <w:p>
+      <w:pPr>
+        <w:spacing w:before="240" w:after="240"/>
+        <w:rPr>
+          <w:sz w:val="24"/>
+          <w:szCs w:val="24"/>
+        </w:rPr>
+      </w:pPr>
+    </w:p>
+    <w:p>
+      <w:pPr>
+        <w:spacing w:before="240" w:after="240"/>
+        <w:rPr>
+          <w:sz w:val="24"/>
+          <w:szCs w:val="24"/>
+        </w:rPr>
+      </w:pPr>
+    </w:p>
+    <w:p>
+      <w:pPr>
+        <w:spacing w:before="240" w:after="240"/>
+        <w:rPr>
+          <w:sz w:val="24"/>
+          <w:szCs w:val="24"/>
+        </w:rPr>
+      </w:pPr>
+    </w:p>
+    <w:p>
+      <w:pPr>
+        <w:spacing w:before="240" w:after="240"/>
+        <w:rPr>
+          <w:sz w:val="24"/>
+          <w:szCs w:val="24"/>
+        </w:rPr>
+      </w:pPr>
+    </w:p>
+    <w:p/>
+    <w:p/>
+    <w:p/>
+    <w:p>
+      <w:pPr>
+        <w:pStyle w:val="Heading1"/>
+        <w:rPr>
+          <w:rFonts w:ascii="Times New Roman" w:hAnsi="Times New Roman" w:cs="Times New Roman"/>
+          <w:b/>
+          <w:bCs/>
+          <w:sz w:val="24"/>
+          <w:szCs w:val="24"/>
+          <w:lang w:val="es-CR"/>
+        </w:rPr>
+      </w:pPr>
+      <w:bookmarkStart w:id="1" w:name="_Toc244292536"/>
+      <w:r>
+        <w:rPr>
+          <w:rFonts w:ascii="Times New Roman" w:hAnsi="Times New Roman" w:cs="Times New Roman"/>
+          <w:b/>
+          <w:bCs/>
+          <w:sz w:val="24"/>
+          <w:szCs w:val="24"/>
+          <w:lang w:val="es-CR"/>
+        </w:rPr>
+        <w:t>Repositorio del proyecto</w:t>
+      </w:r>
+      <w:bookmarkEnd w:id="1"/>
+    </w:p>
+    <w:p>
+      <w:pPr>
+        <w:rPr>
+          <w:rFonts w:ascii="Times New Roman" w:hAnsi="Times New Roman" w:cs="Times New Roman"/>
+          <w:sz w:val="24"/>
+          <w:szCs w:val="24"/>
+          <w:lang w:val="es-CR"/>
+        </w:rPr>
+      </w:pPr>
+    </w:p>
+    <w:p>
+      <w:pPr>
+        <w:rPr>
+          <w:rFonts w:ascii="Times New Roman" w:hAnsi="Times New Roman" w:cs="Times New Roman"/>
+          <w:sz w:val="24"/>
+          <w:szCs w:val="24"/>
+          <w:lang w:val="es-CR"/>
+        </w:rPr>
+      </w:pPr>
+      <w:r>
+        <w:rPr>
+          <w:rFonts w:ascii="Times New Roman" w:hAnsi="Times New Roman" w:cs="Times New Roman"/>
+          <w:sz w:val="24"/>
+          <w:szCs w:val="24"/>
+          <w:lang w:val="es-CR"/>
+        </w:rPr>
+        <w:t>El código fuente, los scripts SQL, la definición de los pipelines de Azure Data Factory y la evidencia de los avances semanales del equipo se encuentran disponibles en el siguiente repositorio de GitHub:</w:t>
+      </w:r>
+    </w:p>
+    <w:p>
+      <w:pPr>
+        <w:rPr>
+          <w:lang w:val="es-CR"/>
+        </w:rPr>
+      </w:pPr>
+    </w:p>
+    <w:p>
+      <w:pPr>
+        <w:rPr>
+          <w:lang w:val="es-CR"/>
+        </w:rPr>
+      </w:pPr>
+      <w:hyperlink r:id="rId7" w:history="1">
+        <w:r>
+          <w:rPr>
+            <w:rStyle w:val="Hyperlink"/>
+            <w:lang w:val="es-CR"/>
+          </w:rPr>
+          <w:t>https://github.com/emilyzuniga049/Primer_Proyecto_Warehouse.git</w:t>
+        </w:r>
+      </w:hyperlink>
+    </w:p>
+    <w:p>
+      <w:pPr>
+        <w:rPr>
+          <w:lang w:val="es-CR"/>
+        </w:rPr>
+      </w:pPr>
+    </w:p>
+    <w:p>
+      <w:pPr>
+        <w:rPr>
+          <w:lang w:val="es-CR"/>
+        </w:rPr>
+      </w:pPr>
+    </w:p>
+    <w:p>
+      <w:pPr>
+        <w:rPr>
+          <w:lang w:val="es-CR"/>
+        </w:rPr>
+      </w:pPr>
+    </w:p>
+    <w:p>
+      <w:pPr>
+        <w:rPr>
+          <w:lang w:val="es-CR"/>
+        </w:rPr>
+      </w:pPr>
+    </w:p>
+    <w:p>
+      <w:pPr>
+        <w:rPr>
+          <w:lang w:val="es-CR"/>
+        </w:rPr>
+      </w:pPr>
+    </w:p>
+    <w:p>
+      <w:pPr>
+        <w:rPr>
+          <w:lang w:val="es-CR"/>
+        </w:rPr>
+      </w:pPr>
+    </w:p>
+    <w:p>
+      <w:pPr>
+        <w:rPr>
+          <w:lang w:val="es-CR"/>
+        </w:rPr>
+      </w:pPr>
+    </w:p>
+    <w:p>
+      <w:pPr>
+        <w:rPr>
+          <w:lang w:val="es-CR"/>
+        </w:rPr>
+      </w:pPr>
+    </w:p>
+    <w:p>
+      <w:pPr>
+        <w:rPr>
+          <w:lang w:val="es-CR"/>
+        </w:rPr>
+      </w:pPr>
+    </w:p>
+    <w:p>
+      <w:pPr>
+        <w:rPr>
+          <w:lang w:val="es-CR"/>
+        </w:rPr>
+      </w:pPr>
+    </w:p>
+    <w:p>
+      <w:pPr>
+        <w:rPr>
+          <w:lang w:val="es-CR"/>
+        </w:rPr>
+      </w:pPr>
+    </w:p>
+    <w:p>
+      <w:pPr>
+        <w:rPr>
+          <w:lang w:val="es-CR"/>
+        </w:rPr>
+      </w:pPr>
+    </w:p>
+    <w:p>
+      <w:pPr>
+        <w:rPr>
+          <w:lang w:val="es-CR"/>
+        </w:rPr>
+      </w:pPr>
+    </w:p>
+    <w:p>
+      <w:pPr>
+        <w:rPr>
+          <w:lang w:val="es-CR"/>
+        </w:rPr>
+      </w:pPr>
+    </w:p>
+    <w:p>
+      <w:pPr>
+        <w:rPr>
+          <w:lang w:val="es-CR"/>
+        </w:rPr>
+      </w:pPr>
+    </w:p>
+    <w:p>
+      <w:pPr>
+        <w:rPr>
+          <w:lang w:val="es-CR"/>
+        </w:rPr>
+      </w:pPr>
+    </w:p>
+    <w:p>
+      <w:pPr>
+        <w:rPr>
+          <w:lang w:val="es-CR"/>
+        </w:rPr>
+      </w:pPr>
+    </w:p>
+    <w:p>
+      <w:pPr>
+        <w:rPr>
+          <w:lang w:val="es-CR"/>
+        </w:rPr>
+      </w:pPr>
+    </w:p>
+    <w:p>
+      <w:pPr>
+        <w:rPr>
+          <w:lang w:val="es-CR"/>
+        </w:rPr>
+      </w:pPr>
+    </w:p>
+    <w:p>
+      <w:pPr>
+        <w:rPr>
+          <w:lang w:val="es-CR"/>
+        </w:rPr>
+      </w:pPr>
+    </w:p>
+    <w:p>
+      <w:pPr>
+        <w:rPr>
+          <w:lang w:val="es-CR"/>
+        </w:rPr>
+      </w:pPr>
+    </w:p>
+    <w:p>
+      <w:pPr>
+        <w:rPr>
+          <w:lang w:val="es-CR"/>
+        </w:rPr>
+      </w:pPr>
+    </w:p>
+    <w:p>
+      <w:pPr>
+        <w:rPr>
+          <w:lang w:val="es-CR"/>
+        </w:rPr>
+      </w:pPr>
+    </w:p>
+    <w:p>
+      <w:pPr>
+        <w:rPr>
+          <w:lang w:val="es-CR"/>
+        </w:rPr>
+      </w:pPr>
+    </w:p>
+    <w:p>
+      <w:pPr>
+        <w:rPr>
+          <w:lang w:val="es-CR"/>
+        </w:rPr>
+      </w:pPr>
+    </w:p>
+    <w:p>
+      <w:pPr>
+        <w:rPr>
+          <w:lang w:val="es-CR"/>
+        </w:rPr>
+      </w:pPr>
+    </w:p>
+    <w:p>
+      <w:pPr>
+        <w:rPr>
+          <w:lang w:val="es-CR"/>
+        </w:rPr>
+      </w:pPr>
+    </w:p>
+    <w:p>
+      <w:pPr>
+        <w:rPr>
+          <w:lang w:val="es-CR"/>
+        </w:rPr>
+      </w:pPr>
+    </w:p>
+    <w:p>
+      <w:pPr>
+        <w:rPr>
+          <w:lang w:val="es-CR"/>
+        </w:rPr>
+      </w:pPr>
+    </w:p>
+    <w:p>
+      <w:pPr>
+        <w:rPr>
+          <w:lang w:val="es-CR"/>
+        </w:rPr>
+      </w:pPr>
+    </w:p>
+    <w:p>
+      <w:pPr>
+        <w:rPr>
+          <w:lang w:val="es-CR"/>
+        </w:rPr>
+      </w:pPr>
+    </w:p>
+    <w:p>
+      <w:pPr>
+        <w:rPr>
+          <w:lang w:val="es-CR"/>
+        </w:rPr>
+      </w:pPr>
+    </w:p>
+    <w:p>
+      <w:pPr>
+        <w:rPr>
+          <w:lang w:val="es-CR"/>
+        </w:rPr>
+      </w:pPr>
+    </w:p>
+    <w:p>
+      <w:pPr>
+        <w:rPr>
+          <w:lang w:val="es-CR"/>
+        </w:rPr>
+      </w:pPr>
+    </w:p>
+    <w:p>
+      <w:pPr>
+        <w:rPr>
+          <w:lang w:val="es-CR"/>
+        </w:rPr>
+      </w:pPr>
+    </w:p>
+    <w:p>
+      <w:pPr>
+        <w:rPr>
+          <w:lang w:val="es-CR"/>
+        </w:rPr>
+      </w:pPr>
+    </w:p>
+    <w:p>
+      <w:pPr>
+        <w:rPr>
+          <w:lang w:val="es-CR"/>
+        </w:rPr>
+      </w:pPr>
+    </w:p>
+    <w:p>
+      <w:pPr>
+        <w:rPr>
+          <w:lang w:val="es-CR"/>
+        </w:rPr>
+      </w:pPr>
+    </w:p>
+    <w:p>
+      <w:pPr>
+        <w:pStyle w:val="Heading1"/>
+        <w:rPr>
+          <w:rFonts w:ascii="Times New Roman" w:hAnsi="Times New Roman" w:cs="Times New Roman"/>
+          <w:b/>
+          <w:bCs/>
+          <w:sz w:val="24"/>
+          <w:szCs w:val="24"/>
+        </w:rPr>
+      </w:pPr>
+      <w:bookmarkStart w:id="2" w:name="_ixbi0uwxh65w" w:colFirst="0" w:colLast="0"/>
+      <w:bookmarkStart w:id="3" w:name="_Toc244292537"/>
+      <w:bookmarkEnd w:id="2"/>
+      <w:r>
+        <w:rPr>
+          <w:rFonts w:ascii="Times New Roman" w:hAnsi="Times New Roman" w:cs="Times New Roman"/>
+          <w:b/>
+          <w:bCs/>
+          <w:sz w:val="24"/>
+          <w:szCs w:val="24"/>
+        </w:rPr>
         <w:t>Enunciado del problema</w:t>
       </w:r>
-      <w:bookmarkEnd w:id="1"/>
+      <w:bookmarkEnd w:id="3"/>
     </w:p>
     <w:p>
       <w:pPr>
         <w:spacing w:before="240" w:after="240"/>
         <w:jc w:val="both"/>
         <w:rPr>
+          <w:rFonts w:ascii="Times New Roman" w:eastAsia="Times New Roman" w:hAnsi="Times New Roman" w:cs="Times New Roman"/>
           <w:sz w:val="24"/>
           <w:szCs w:val="24"/>
         </w:rPr>
@@ -1029,6 +2235,7 @@
       <w:proofErr w:type="spellStart"/>
       <w:r>
         <w:rPr>
+          <w:rFonts w:ascii="Times New Roman" w:eastAsia="Times New Roman" w:hAnsi="Times New Roman" w:cs="Times New Roman"/>
           <w:sz w:val="24"/>
           <w:szCs w:val="24"/>
         </w:rPr>
@@ -1037,6 +2244,7 @@
       <w:proofErr w:type="spellEnd"/>
       <w:r>
         <w:rPr>
+          <w:rFonts w:ascii="Times New Roman" w:eastAsia="Times New Roman" w:hAnsi="Times New Roman" w:cs="Times New Roman"/>
           <w:sz w:val="24"/>
           <w:szCs w:val="24"/>
         </w:rPr>
@@ -1045,6 +2253,7 @@
       <w:proofErr w:type="spellStart"/>
       <w:r>
         <w:rPr>
+          <w:rFonts w:ascii="Times New Roman" w:eastAsia="Times New Roman" w:hAnsi="Times New Roman" w:cs="Times New Roman"/>
           <w:sz w:val="24"/>
           <w:szCs w:val="24"/>
         </w:rPr>
@@ -1053,14 +2262,66 @@
       <w:proofErr w:type="spellEnd"/>
       <w:r>
         <w:rPr>
-          <w:sz w:val="24"/>
-          <w:szCs w:val="24"/>
-        </w:rPr>
-        <w:t xml:space="preserve"> S.A. almacena su información operativa en una base de datos transaccional diseñada para registrar operaciones diarias, no para analizarlas. Esta estructura dificulta obtener información consolidada e histórica que apoye la toma de decisiones, pues las consultas analíticas son lentas, complejas y dependen de datos con problemas de calidad. Por ello, la empresa requiere implementar un data </w:t>
+          <w:rFonts w:ascii="Times New Roman" w:eastAsia="Times New Roman" w:hAnsi="Times New Roman" w:cs="Times New Roman"/>
+          <w:sz w:val="24"/>
+          <w:szCs w:val="24"/>
+        </w:rPr>
+        <w:t xml:space="preserve"> S.A. almacena su información operativa en una base de datos transaccional diseñada para registrar las operaciones diarias de la empresa, no para analizarlas. Este tipo de base de datos está normalizada y optimizada para insertar, actualizar y consultar registros individuales de forma rápida, pero no para responder preguntas de negocio que requieren combinar información de muchas tablas, resumir grandes volúmenes de registros o comparar resultados entre distintos periodos.</w:t>
+      </w:r>
+    </w:p>
+    <w:p>
+      <w:pPr>
+        <w:spacing w:before="240" w:after="240"/>
+        <w:jc w:val="both"/>
+        <w:rPr>
+          <w:rFonts w:ascii="Times New Roman" w:eastAsia="Times New Roman" w:hAnsi="Times New Roman" w:cs="Times New Roman"/>
+          <w:sz w:val="24"/>
+          <w:szCs w:val="24"/>
+        </w:rPr>
+      </w:pPr>
+      <w:r>
+        <w:rPr>
+          <w:rFonts w:ascii="Times New Roman" w:eastAsia="Times New Roman" w:hAnsi="Times New Roman" w:cs="Times New Roman"/>
+          <w:sz w:val="24"/>
+          <w:szCs w:val="24"/>
+        </w:rPr>
+        <w:t>Como consecuencia, obtener información consolidada e histórica que apoye la toma de decisiones resulta difícil. Las consultas analíticas son lentas y complejas, requieren conocimientos técnicos para construirse y, al ejecutarse sobre el mismo sistema que soporta la operación diaria, pueden afectar su rendimiento. A esto se suma que los datos presentan problemas de calidad, como valores nulos, registros duplicados y formatos inconsistentes, lo que reduce la confiabilidad de cualquier reporte generado directamente desde la fuente.</w:t>
+      </w:r>
+    </w:p>
+    <w:p>
+      <w:pPr>
+        <w:spacing w:before="240" w:after="240"/>
+        <w:jc w:val="both"/>
+        <w:rPr>
+          <w:rFonts w:ascii="Times New Roman" w:eastAsia="Times New Roman" w:hAnsi="Times New Roman" w:cs="Times New Roman"/>
+          <w:sz w:val="24"/>
+          <w:szCs w:val="24"/>
+        </w:rPr>
+      </w:pPr>
+      <w:r>
+        <w:rPr>
+          <w:rFonts w:ascii="Times New Roman" w:eastAsia="Times New Roman" w:hAnsi="Times New Roman" w:cs="Times New Roman"/>
+          <w:sz w:val="24"/>
+          <w:szCs w:val="24"/>
+        </w:rPr>
+        <w:t xml:space="preserve">Esta situación limita la capacidad de la gerencia y de los usuarios clave para identificar tendencias, evaluar el desempeño del negocio y tomar decisiones oportunas basadas en datos. Por ello, la empresa requiere implementar un </w:t>
+      </w:r>
+      <w:r>
+        <w:rPr>
+          <w:rFonts w:ascii="Times New Roman" w:eastAsia="Times New Roman" w:hAnsi="Times New Roman" w:cs="Times New Roman"/>
+          <w:i/>
+          <w:iCs/>
+          <w:sz w:val="24"/>
+          <w:szCs w:val="24"/>
+        </w:rPr>
+        <w:t xml:space="preserve">data </w:t>
       </w:r>
       <w:proofErr w:type="spellStart"/>
       <w:r>
         <w:rPr>
+          <w:rFonts w:ascii="Times New Roman" w:eastAsia="Times New Roman" w:hAnsi="Times New Roman" w:cs="Times New Roman"/>
+          <w:i/>
+          <w:iCs/>
           <w:sz w:val="24"/>
           <w:szCs w:val="24"/>
         </w:rPr>
@@ -1069,52 +2330,19 @@
       <w:proofErr w:type="spellEnd"/>
       <w:r>
         <w:rPr>
-          <w:sz w:val="24"/>
-          <w:szCs w:val="24"/>
-        </w:rPr>
-        <w:t xml:space="preserve"> en la nube que integre, depure y organice sus datos en un modelo orientado al análisis. </w:t>
-      </w:r>
-    </w:p>
-    <w:p>
-      <w:pPr>
-        <w:spacing w:before="240" w:after="240"/>
-        <w:rPr>
-          <w:sz w:val="24"/>
-          <w:szCs w:val="24"/>
-        </w:rPr>
-      </w:pPr>
-    </w:p>
-    <w:p>
-      <w:pPr>
-        <w:spacing w:before="240" w:after="240"/>
-        <w:rPr>
-          <w:sz w:val="24"/>
-          <w:szCs w:val="24"/>
-        </w:rPr>
-      </w:pPr>
-    </w:p>
-    <w:p>
-      <w:pPr>
-        <w:spacing w:before="240" w:after="240"/>
-        <w:rPr>
-          <w:sz w:val="24"/>
-          <w:szCs w:val="24"/>
-        </w:rPr>
-      </w:pPr>
-    </w:p>
-    <w:p>
-      <w:pPr>
-        <w:spacing w:before="240" w:after="240"/>
-        <w:rPr>
-          <w:sz w:val="24"/>
-          <w:szCs w:val="24"/>
-        </w:rPr>
-      </w:pPr>
-    </w:p>
-    <w:p>
-      <w:pPr>
-        <w:spacing w:before="240" w:after="240"/>
-        <w:rPr>
+          <w:rFonts w:ascii="Times New Roman" w:eastAsia="Times New Roman" w:hAnsi="Times New Roman" w:cs="Times New Roman"/>
+          <w:sz w:val="24"/>
+          <w:szCs w:val="24"/>
+        </w:rPr>
+        <w:t xml:space="preserve"> en la nube que integre, depure y organice sus datos en un modelo orientado al análisis, de manera que la información pueda consultarse de forma sencilla, rápida y confiable.</w:t>
+      </w:r>
+    </w:p>
+    <w:p>
+      <w:pPr>
+        <w:spacing w:before="240" w:after="240"/>
+        <w:jc w:val="both"/>
+        <w:rPr>
+          <w:rFonts w:ascii="Times New Roman" w:eastAsia="Times New Roman" w:hAnsi="Times New Roman" w:cs="Times New Roman"/>
           <w:sz w:val="24"/>
           <w:szCs w:val="24"/>
         </w:rPr>
@@ -1232,17 +2460,19 @@
       <w:pPr>
         <w:pStyle w:val="Heading1"/>
         <w:rPr>
-          <w:b/>
-          <w:bCs/>
-          <w:sz w:val="24"/>
-          <w:szCs w:val="24"/>
-        </w:rPr>
-      </w:pPr>
-      <w:bookmarkStart w:id="2" w:name="_4ge97dizflv" w:colFirst="0" w:colLast="0"/>
-      <w:bookmarkStart w:id="3" w:name="_Toc243925041"/>
-      <w:bookmarkEnd w:id="2"/>
-      <w:r>
-        <w:rPr>
+          <w:rFonts w:ascii="Times New Roman" w:hAnsi="Times New Roman" w:cs="Times New Roman"/>
+          <w:b/>
+          <w:bCs/>
+          <w:sz w:val="24"/>
+          <w:szCs w:val="24"/>
+        </w:rPr>
+      </w:pPr>
+      <w:bookmarkStart w:id="4" w:name="_4ge97dizflv" w:colFirst="0" w:colLast="0"/>
+      <w:bookmarkStart w:id="5" w:name="_Toc244292538"/>
+      <w:bookmarkEnd w:id="4"/>
+      <w:r>
+        <w:rPr>
+          <w:rFonts w:ascii="Times New Roman" w:hAnsi="Times New Roman" w:cs="Times New Roman"/>
           <w:b/>
           <w:bCs/>
           <w:sz w:val="24"/>
@@ -1250,19 +2480,21 @@
         </w:rPr>
         <w:t>Objetivo General</w:t>
       </w:r>
-      <w:bookmarkEnd w:id="3"/>
+      <w:bookmarkEnd w:id="5"/>
     </w:p>
     <w:p>
       <w:pPr>
         <w:spacing w:before="240" w:after="240"/>
         <w:jc w:val="both"/>
         <w:rPr>
-          <w:sz w:val="24"/>
-          <w:szCs w:val="24"/>
-        </w:rPr>
-      </w:pPr>
-      <w:r>
-        <w:rPr>
+          <w:rFonts w:ascii="Times New Roman" w:eastAsia="Times New Roman" w:hAnsi="Times New Roman" w:cs="Times New Roman"/>
+          <w:sz w:val="24"/>
+          <w:szCs w:val="24"/>
+        </w:rPr>
+      </w:pPr>
+      <w:r>
+        <w:rPr>
+          <w:rFonts w:ascii="Times New Roman" w:eastAsia="Times New Roman" w:hAnsi="Times New Roman" w:cs="Times New Roman"/>
           <w:sz w:val="24"/>
           <w:szCs w:val="24"/>
         </w:rPr>
@@ -1271,6 +2503,7 @@
       <w:proofErr w:type="spellStart"/>
       <w:r>
         <w:rPr>
+          <w:rFonts w:ascii="Times New Roman" w:eastAsia="Times New Roman" w:hAnsi="Times New Roman" w:cs="Times New Roman"/>
           <w:sz w:val="24"/>
           <w:szCs w:val="24"/>
         </w:rPr>
@@ -1279,6 +2512,7 @@
       <w:proofErr w:type="spellEnd"/>
       <w:r>
         <w:rPr>
+          <w:rFonts w:ascii="Times New Roman" w:eastAsia="Times New Roman" w:hAnsi="Times New Roman" w:cs="Times New Roman"/>
           <w:sz w:val="24"/>
           <w:szCs w:val="24"/>
         </w:rPr>
@@ -1287,6 +2521,7 @@
       <w:proofErr w:type="spellStart"/>
       <w:r>
         <w:rPr>
+          <w:rFonts w:ascii="Times New Roman" w:eastAsia="Times New Roman" w:hAnsi="Times New Roman" w:cs="Times New Roman"/>
           <w:sz w:val="24"/>
           <w:szCs w:val="24"/>
         </w:rPr>
@@ -1295,6 +2530,7 @@
       <w:proofErr w:type="spellEnd"/>
       <w:r>
         <w:rPr>
+          <w:rFonts w:ascii="Times New Roman" w:eastAsia="Times New Roman" w:hAnsi="Times New Roman" w:cs="Times New Roman"/>
           <w:sz w:val="24"/>
           <w:szCs w:val="24"/>
         </w:rPr>
@@ -1303,6 +2539,7 @@
       <w:proofErr w:type="spellStart"/>
       <w:r>
         <w:rPr>
+          <w:rFonts w:ascii="Times New Roman" w:eastAsia="Times New Roman" w:hAnsi="Times New Roman" w:cs="Times New Roman"/>
           <w:sz w:val="24"/>
           <w:szCs w:val="24"/>
         </w:rPr>
@@ -1311,24 +2548,18 @@
       <w:proofErr w:type="spellEnd"/>
       <w:r>
         <w:rPr>
-          <w:sz w:val="24"/>
-          <w:szCs w:val="24"/>
-        </w:rPr>
-        <w:t xml:space="preserve"> S.A. en Microsoft Azure, mediante un proceso ETL desarrollado con Azure Data Factory y un modelo dimensional, que </w:t>
-      </w:r>
-      <w:r>
-        <w:rPr>
-          <w:sz w:val="24"/>
-          <w:szCs w:val="24"/>
-        </w:rPr>
-        <w:lastRenderedPageBreak/>
-        <w:t xml:space="preserve">permita consolidar la información de la base de datos transaccional y facilitar su análisis para la toma de decisiones. </w:t>
-      </w:r>
-    </w:p>
-    <w:p>
-      <w:pPr>
-        <w:spacing w:before="240" w:after="240"/>
-        <w:rPr>
+          <w:rFonts w:ascii="Times New Roman" w:eastAsia="Times New Roman" w:hAnsi="Times New Roman" w:cs="Times New Roman"/>
+          <w:sz w:val="24"/>
+          <w:szCs w:val="24"/>
+        </w:rPr>
+        <w:t xml:space="preserve"> S.A. en Microsoft Azure, mediante un proceso ETL desarrollado con Azure Data Factory y un modelo dimensional, que permita consolidar la información de la base de datos transaccional y facilitar su análisis para la toma de decisiones. </w:t>
+      </w:r>
+    </w:p>
+    <w:p>
+      <w:pPr>
+        <w:spacing w:before="240" w:after="240"/>
+        <w:rPr>
+          <w:rFonts w:ascii="Times New Roman" w:eastAsia="Times New Roman" w:hAnsi="Times New Roman" w:cs="Times New Roman"/>
           <w:sz w:val="24"/>
           <w:szCs w:val="24"/>
         </w:rPr>
@@ -1338,17 +2569,19 @@
       <w:pPr>
         <w:pStyle w:val="Heading1"/>
         <w:rPr>
-          <w:b/>
-          <w:bCs/>
-          <w:sz w:val="24"/>
-          <w:szCs w:val="24"/>
-        </w:rPr>
-      </w:pPr>
-      <w:bookmarkStart w:id="4" w:name="_l6cxa0pxmtat" w:colFirst="0" w:colLast="0"/>
-      <w:bookmarkStart w:id="5" w:name="_Toc243925042"/>
-      <w:bookmarkEnd w:id="4"/>
-      <w:r>
-        <w:rPr>
+          <w:rFonts w:ascii="Times New Roman" w:hAnsi="Times New Roman" w:cs="Times New Roman"/>
+          <w:b/>
+          <w:bCs/>
+          <w:sz w:val="24"/>
+          <w:szCs w:val="24"/>
+        </w:rPr>
+      </w:pPr>
+      <w:bookmarkStart w:id="6" w:name="_l6cxa0pxmtat" w:colFirst="0" w:colLast="0"/>
+      <w:bookmarkStart w:id="7" w:name="_Toc244292539"/>
+      <w:bookmarkEnd w:id="6"/>
+      <w:r>
+        <w:rPr>
+          <w:rFonts w:ascii="Times New Roman" w:hAnsi="Times New Roman" w:cs="Times New Roman"/>
           <w:b/>
           <w:bCs/>
           <w:sz w:val="24"/>
@@ -1356,9 +2589,10 @@
         </w:rPr>
         <w:t>Objetivos Específicos</w:t>
       </w:r>
-      <w:bookmarkEnd w:id="5"/>
-      <w:r>
-        <w:rPr>
+      <w:bookmarkEnd w:id="7"/>
+      <w:r>
+        <w:rPr>
+          <w:rFonts w:ascii="Times New Roman" w:hAnsi="Times New Roman" w:cs="Times New Roman"/>
           <w:b/>
           <w:bCs/>
           <w:sz w:val="24"/>
@@ -1376,12 +2610,14 @@
         <w:spacing w:before="240"/>
         <w:jc w:val="both"/>
         <w:rPr>
-          <w:sz w:val="24"/>
-          <w:szCs w:val="24"/>
-        </w:rPr>
-      </w:pPr>
-      <w:r>
-        <w:rPr>
+          <w:rFonts w:ascii="Times New Roman" w:eastAsia="Times New Roman" w:hAnsi="Times New Roman" w:cs="Times New Roman"/>
+          <w:sz w:val="24"/>
+          <w:szCs w:val="24"/>
+        </w:rPr>
+      </w:pPr>
+      <w:r>
+        <w:rPr>
+          <w:rFonts w:ascii="Times New Roman" w:eastAsia="Times New Roman" w:hAnsi="Times New Roman" w:cs="Times New Roman"/>
           <w:sz w:val="24"/>
           <w:szCs w:val="24"/>
         </w:rPr>
@@ -1390,6 +2626,7 @@
       <w:proofErr w:type="spellStart"/>
       <w:r>
         <w:rPr>
+          <w:rFonts w:ascii="Times New Roman" w:eastAsia="Times New Roman" w:hAnsi="Times New Roman" w:cs="Times New Roman"/>
           <w:sz w:val="24"/>
           <w:szCs w:val="24"/>
         </w:rPr>
@@ -1398,6 +2635,7 @@
       <w:proofErr w:type="spellEnd"/>
       <w:r>
         <w:rPr>
+          <w:rFonts w:ascii="Times New Roman" w:eastAsia="Times New Roman" w:hAnsi="Times New Roman" w:cs="Times New Roman"/>
           <w:sz w:val="24"/>
           <w:szCs w:val="24"/>
         </w:rPr>
@@ -1412,12 +2650,14 @@
         </w:numPr>
         <w:jc w:val="both"/>
         <w:rPr>
-          <w:sz w:val="24"/>
-          <w:szCs w:val="24"/>
-        </w:rPr>
-      </w:pPr>
-      <w:r>
-        <w:rPr>
+          <w:rFonts w:ascii="Times New Roman" w:eastAsia="Times New Roman" w:hAnsi="Times New Roman" w:cs="Times New Roman"/>
+          <w:sz w:val="24"/>
+          <w:szCs w:val="24"/>
+        </w:rPr>
+      </w:pPr>
+      <w:r>
+        <w:rPr>
+          <w:rFonts w:ascii="Times New Roman" w:eastAsia="Times New Roman" w:hAnsi="Times New Roman" w:cs="Times New Roman"/>
           <w:sz w:val="24"/>
           <w:szCs w:val="24"/>
         </w:rPr>
@@ -1432,12 +2672,14 @@
         </w:numPr>
         <w:jc w:val="both"/>
         <w:rPr>
-          <w:sz w:val="24"/>
-          <w:szCs w:val="24"/>
-        </w:rPr>
-      </w:pPr>
-      <w:r>
-        <w:rPr>
+          <w:rFonts w:ascii="Times New Roman" w:eastAsia="Times New Roman" w:hAnsi="Times New Roman" w:cs="Times New Roman"/>
+          <w:sz w:val="24"/>
+          <w:szCs w:val="24"/>
+        </w:rPr>
+      </w:pPr>
+      <w:r>
+        <w:rPr>
+          <w:rFonts w:ascii="Times New Roman" w:eastAsia="Times New Roman" w:hAnsi="Times New Roman" w:cs="Times New Roman"/>
           <w:sz w:val="24"/>
           <w:szCs w:val="24"/>
         </w:rPr>
@@ -1452,12 +2694,14 @@
         </w:numPr>
         <w:jc w:val="both"/>
         <w:rPr>
-          <w:sz w:val="24"/>
-          <w:szCs w:val="24"/>
-        </w:rPr>
-      </w:pPr>
-      <w:r>
-        <w:rPr>
+          <w:rFonts w:ascii="Times New Roman" w:eastAsia="Times New Roman" w:hAnsi="Times New Roman" w:cs="Times New Roman"/>
+          <w:sz w:val="24"/>
+          <w:szCs w:val="24"/>
+        </w:rPr>
+      </w:pPr>
+      <w:r>
+        <w:rPr>
+          <w:rFonts w:ascii="Times New Roman" w:eastAsia="Times New Roman" w:hAnsi="Times New Roman" w:cs="Times New Roman"/>
           <w:sz w:val="24"/>
           <w:szCs w:val="24"/>
         </w:rPr>
@@ -1466,6 +2710,7 @@
       <w:proofErr w:type="spellStart"/>
       <w:r>
         <w:rPr>
+          <w:rFonts w:ascii="Times New Roman" w:eastAsia="Times New Roman" w:hAnsi="Times New Roman" w:cs="Times New Roman"/>
           <w:sz w:val="24"/>
           <w:szCs w:val="24"/>
         </w:rPr>
@@ -1474,14 +2719,16 @@
       <w:proofErr w:type="spellEnd"/>
       <w:r>
         <w:rPr>
-          <w:sz w:val="24"/>
-          <w:szCs w:val="24"/>
-        </w:rPr>
-        <w:t xml:space="preserve"> alojado en SQL </w:t>
+          <w:rFonts w:ascii="Times New Roman" w:eastAsia="Times New Roman" w:hAnsi="Times New Roman" w:cs="Times New Roman"/>
+          <w:sz w:val="24"/>
+          <w:szCs w:val="24"/>
+        </w:rPr>
+        <w:t xml:space="preserve"> alojado en Azure SQL </w:t>
       </w:r>
       <w:proofErr w:type="spellStart"/>
       <w:r>
         <w:rPr>
+          <w:rFonts w:ascii="Times New Roman" w:eastAsia="Times New Roman" w:hAnsi="Times New Roman" w:cs="Times New Roman"/>
           <w:sz w:val="24"/>
           <w:szCs w:val="24"/>
         </w:rPr>
@@ -1490,6 +2737,7 @@
       <w:proofErr w:type="spellEnd"/>
       <w:r>
         <w:rPr>
+          <w:rFonts w:ascii="Times New Roman" w:eastAsia="Times New Roman" w:hAnsi="Times New Roman" w:cs="Times New Roman"/>
           <w:sz w:val="24"/>
           <w:szCs w:val="24"/>
         </w:rPr>
@@ -1505,26 +2753,32 @@
         <w:spacing w:after="240"/>
         <w:jc w:val="both"/>
         <w:rPr>
-          <w:sz w:val="24"/>
-          <w:szCs w:val="24"/>
-        </w:rPr>
-      </w:pPr>
-      <w:r>
-        <w:rPr>
+          <w:rFonts w:ascii="Times New Roman" w:eastAsia="Times New Roman" w:hAnsi="Times New Roman" w:cs="Times New Roman"/>
+          <w:sz w:val="24"/>
+          <w:szCs w:val="24"/>
+        </w:rPr>
+      </w:pPr>
+      <w:r>
+        <w:rPr>
+          <w:rFonts w:ascii="Times New Roman" w:eastAsia="Times New Roman" w:hAnsi="Times New Roman" w:cs="Times New Roman"/>
           <w:sz w:val="24"/>
           <w:szCs w:val="24"/>
         </w:rPr>
         <w:t xml:space="preserve">Construir informes mediante tablas dinámicas en Excel conectadas </w:t>
       </w:r>
-      <w:r>
-        <w:rPr>
-          <w:sz w:val="24"/>
-          <w:szCs w:val="24"/>
-        </w:rPr>
-        <w:t>a la data</w:t>
-      </w:r>
-      <w:r>
-        <w:rPr>
+      <w:proofErr w:type="gramStart"/>
+      <w:r>
+        <w:rPr>
+          <w:rFonts w:ascii="Times New Roman" w:eastAsia="Times New Roman" w:hAnsi="Times New Roman" w:cs="Times New Roman"/>
+          <w:sz w:val="24"/>
+          <w:szCs w:val="24"/>
+        </w:rPr>
+        <w:t>al data</w:t>
+      </w:r>
+      <w:proofErr w:type="gramEnd"/>
+      <w:r>
+        <w:rPr>
+          <w:rFonts w:ascii="Times New Roman" w:eastAsia="Times New Roman" w:hAnsi="Times New Roman" w:cs="Times New Roman"/>
           <w:sz w:val="24"/>
           <w:szCs w:val="24"/>
         </w:rPr>
@@ -1533,6 +2787,7 @@
       <w:proofErr w:type="spellStart"/>
       <w:r>
         <w:rPr>
+          <w:rFonts w:ascii="Times New Roman" w:eastAsia="Times New Roman" w:hAnsi="Times New Roman" w:cs="Times New Roman"/>
           <w:sz w:val="24"/>
           <w:szCs w:val="24"/>
         </w:rPr>
@@ -1541,6 +2796,7 @@
       <w:proofErr w:type="spellEnd"/>
       <w:r>
         <w:rPr>
+          <w:rFonts w:ascii="Times New Roman" w:eastAsia="Times New Roman" w:hAnsi="Times New Roman" w:cs="Times New Roman"/>
           <w:sz w:val="24"/>
           <w:szCs w:val="24"/>
         </w:rPr>
@@ -1645,6 +2901,166 @@
           <w:szCs w:val="24"/>
         </w:rPr>
       </w:pPr>
+    </w:p>
+    <w:p>
+      <w:pPr>
+        <w:spacing w:before="240" w:after="240"/>
+        <w:rPr>
+          <w:sz w:val="24"/>
+          <w:szCs w:val="24"/>
+        </w:rPr>
+      </w:pPr>
+    </w:p>
+    <w:p>
+      <w:pPr>
+        <w:spacing w:before="240" w:after="240"/>
+        <w:rPr>
+          <w:sz w:val="24"/>
+          <w:szCs w:val="24"/>
+        </w:rPr>
+      </w:pPr>
+    </w:p>
+    <w:p>
+      <w:pPr>
+        <w:pStyle w:val="Heading1"/>
+        <w:rPr>
+          <w:rFonts w:ascii="Times New Roman" w:hAnsi="Times New Roman" w:cs="Times New Roman"/>
+          <w:b/>
+          <w:bCs/>
+          <w:sz w:val="24"/>
+          <w:szCs w:val="24"/>
+        </w:rPr>
+      </w:pPr>
+      <w:bookmarkStart w:id="8" w:name="_Toc244292540"/>
+      <w:r>
+        <w:rPr>
+          <w:rFonts w:ascii="Times New Roman" w:hAnsi="Times New Roman" w:cs="Times New Roman"/>
+          <w:b/>
+          <w:bCs/>
+          <w:sz w:val="24"/>
+          <w:szCs w:val="24"/>
+        </w:rPr>
+        <w:t>Bibliografía</w:t>
+      </w:r>
+      <w:bookmarkEnd w:id="8"/>
+    </w:p>
+    <w:p>
+      <w:pPr>
+        <w:numPr>
+          <w:ilvl w:val="0"/>
+          <w:numId w:val="2"/>
+        </w:numPr>
+        <w:spacing w:before="240"/>
+        <w:rPr>
+          <w:rFonts w:ascii="Times New Roman" w:eastAsia="Times New Roman" w:hAnsi="Times New Roman" w:cs="Times New Roman"/>
+          <w:sz w:val="24"/>
+          <w:szCs w:val="24"/>
+        </w:rPr>
+      </w:pPr>
+      <w:r>
+        <w:rPr>
+          <w:rFonts w:ascii="Times New Roman" w:eastAsia="Times New Roman" w:hAnsi="Times New Roman" w:cs="Times New Roman"/>
+          <w:sz w:val="24"/>
+          <w:szCs w:val="24"/>
+          <w:lang w:val="en-US"/>
+        </w:rPr>
+        <w:t xml:space="preserve">Inmon, W. H. (2005). </w:t>
+      </w:r>
+      <w:r>
+        <w:rPr>
+          <w:rFonts w:ascii="Times New Roman" w:eastAsia="Times New Roman" w:hAnsi="Times New Roman" w:cs="Times New Roman"/>
+          <w:i/>
+          <w:iCs/>
+          <w:sz w:val="24"/>
+          <w:szCs w:val="24"/>
+          <w:lang w:val="en-US"/>
+        </w:rPr>
+        <w:t>Building the data warehouse</w:t>
+      </w:r>
+      <w:r>
+        <w:rPr>
+          <w:rFonts w:ascii="Times New Roman" w:eastAsia="Times New Roman" w:hAnsi="Times New Roman" w:cs="Times New Roman"/>
+          <w:sz w:val="24"/>
+          <w:szCs w:val="24"/>
+          <w:lang w:val="en-US"/>
+        </w:rPr>
+        <w:t xml:space="preserve"> (4.ª ed.). </w:t>
+      </w:r>
+      <w:r>
+        <w:rPr>
+          <w:rFonts w:ascii="Times New Roman" w:eastAsia="Times New Roman" w:hAnsi="Times New Roman" w:cs="Times New Roman"/>
+          <w:sz w:val="24"/>
+          <w:szCs w:val="24"/>
+        </w:rPr>
+        <w:t>Wiley.</w:t>
+      </w:r>
+    </w:p>
+    <w:p>
+      <w:pPr>
+        <w:numPr>
+          <w:ilvl w:val="0"/>
+          <w:numId w:val="2"/>
+        </w:numPr>
+        <w:spacing w:after="240"/>
+        <w:rPr>
+          <w:rFonts w:ascii="Times New Roman" w:eastAsia="Times New Roman" w:hAnsi="Times New Roman" w:cs="Times New Roman"/>
+          <w:sz w:val="24"/>
+          <w:szCs w:val="24"/>
+        </w:rPr>
+      </w:pPr>
+      <w:r>
+        <w:rPr>
+          <w:rFonts w:ascii="Times New Roman" w:eastAsia="Times New Roman" w:hAnsi="Times New Roman" w:cs="Times New Roman"/>
+          <w:sz w:val="24"/>
+          <w:szCs w:val="24"/>
+          <w:lang w:val="en-US"/>
+        </w:rPr>
+        <w:t xml:space="preserve">Kimball, R., &amp; Ross, M. (2013). </w:t>
+      </w:r>
+      <w:r>
+        <w:rPr>
+          <w:rFonts w:ascii="Times New Roman" w:eastAsia="Times New Roman" w:hAnsi="Times New Roman" w:cs="Times New Roman"/>
+          <w:i/>
+          <w:iCs/>
+          <w:sz w:val="24"/>
+          <w:szCs w:val="24"/>
+          <w:lang w:val="en-US"/>
+        </w:rPr>
+        <w:t>The data warehouse toolkit: The definitive guide to dimensional modeling</w:t>
+      </w:r>
+      <w:r>
+        <w:rPr>
+          <w:rFonts w:ascii="Times New Roman" w:eastAsia="Times New Roman" w:hAnsi="Times New Roman" w:cs="Times New Roman"/>
+          <w:sz w:val="24"/>
+          <w:szCs w:val="24"/>
+          <w:lang w:val="en-US"/>
+        </w:rPr>
+        <w:t xml:space="preserve"> (3.ª ed.). </w:t>
+      </w:r>
+      <w:r>
+        <w:rPr>
+          <w:rFonts w:ascii="Times New Roman" w:eastAsia="Times New Roman" w:hAnsi="Times New Roman" w:cs="Times New Roman"/>
+          <w:sz w:val="24"/>
+          <w:szCs w:val="24"/>
+        </w:rPr>
+        <w:t>Wiley.</w:t>
+      </w:r>
+    </w:p>
+    <w:p>
+      <w:pPr>
+        <w:spacing w:before="240" w:after="240"/>
+        <w:rPr>
+          <w:sz w:val="24"/>
+          <w:szCs w:val="24"/>
+        </w:rPr>
+      </w:pPr>
+      <w:r>
+        <w:rPr>
+          <w:sz w:val="24"/>
+          <w:szCs w:val="24"/>
+        </w:rPr>
+        <w:t xml:space="preserve"> </w:t>
+      </w:r>
     </w:p>
     <w:p>
       <w:pPr>
@@ -1668,9 +3084,122 @@
 <file path=word/numbering.xml><?xml version="1.0" encoding="utf-8"?>
 <w:numbering xmlns:wpc="http://schemas.microsoft.com/office/word/2010/wordprocessingCanvas" xmlns:cx="http://schemas.microsoft.com/office/drawing/2014/chartex" xmlns:cx1="http://schemas.microsoft.com/office/drawing/2015/9/8/chartex" xmlns:cx2="http://schemas.microsoft.com/office/drawing/2015/10/21/chartex" xmlns:cx3="http://schemas.microsoft.com/office/drawing/2016/5/9/chartex" xmlns:cx4="http://schemas.microsoft.com/office/drawing/2016/5/10/chartex" xmlns:cx5="http://schemas.microsoft.com/office/drawing/2016/5/11/chartex" xmlns:cx6="http://schemas.microsoft.com/office/drawing/2016/5/12/chartex" xmlns:cx7="http://schemas.microsoft.com/office/drawing/2016/5/13/chartex" xmlns:cx8="http://schemas.microsoft.com/office/drawing/2016/5/14/chartex" xmlns:mc="http://schemas.openxmlformats.org/markup-compatibility/2006" xmlns:aink="http://schemas.microsoft.com/office/drawing/2016/ink" xmlns:am3d="http://schemas.microsoft.com/office/drawing/2017/model3d" xmlns:o="urn:schemas-microsoft-com:office:office" xmlns:oel="http://schemas.microsoft.com/office/2019/extlst" xmlns:r="http://schemas.openxmlformats.org/officeDocument/2006/relationships" xmlns:m="http://schemas.openxmlformats.org/officeDocument/2006/math" xmlns:v="urn:schemas-microsoft-com:vml" xmlns:wp14="http://schemas.microsoft.com/office/word/2010/wordprocessingDrawing" xmlns:wp="http://schemas.openxmlformats.org/drawingml/2006/wordprocessingDrawing" xmlns:w10="urn:schemas-microsoft-com:office:word" xmlns:w="http://schemas.openxmlformats.org/wordprocessingml/2006/main" xmlns:w14="http://schemas.microsoft.com/office/word/2010/wordml" xmlns:w15="http://schemas.microsoft.com/office/word/2012/wordml" xmlns:w16cex="http://schemas.microsoft.com/office/word/2018/wordml/cex" xmlns:w16cid="http://schemas.microsoft.com/office/word/2016/wordml/cid" xmlns:w16="http://schemas.microsoft.com/office/word/2018/wordml" xmlns:w16du="http://schemas.microsoft.com/office/word/2023/wordml/word16du" xmlns:w16sdtdh="http://schemas.microsoft.com/office/word/2020/wordml/sdtdatahash" xmlns:w16sdtfl="http://schemas.microsoft.com/office/word/2024/wordml/sdtformatlock" xmlns:w16se="http://schemas.microsoft.com/office/word/2015/wordml/symex" xmlns:wpg="http://schemas.microsoft.com/office/word/2010/wordprocessingGroup" xmlns:wpi="http://schemas.microsoft.com/office/word/2010/wordprocessingInk" xmlns:wne="http://schemas.microsoft.com/office/word/2006/wordml" xmlns:wps="http://schemas.microsoft.com/office/word/2010/wordprocessingShape" mc:Ignorable="w14 w15 w16se w16cid w16 w16cex w16sdtdh w16sdtfl w16du wp14">
   <w:abstractNum w:abstractNumId="0" w15:restartNumberingAfterBreak="0">
-    <w:nsid w:val="379D5349"/>
+    <w:nsid w:val="1AE169E6"/>
     <w:multiLevelType w:val="multilevel"/>
-    <w:tmpl w:val="F400323A"/>
+    <w:tmpl w:val="D2DA84BC"/>
+    <w:lvl w:ilvl="0">
+      <w:start w:val="1"/>
+      <w:numFmt w:val="bullet"/>
+      <w:lvlText w:val="●"/>
+      <w:lvlJc w:val="left"/>
+      <w:pPr>
+        <w:ind w:left="720" w:hanging="360"/>
+      </w:pPr>
+      <w:rPr>
+        <w:u w:val="none"/>
+      </w:rPr>
+    </w:lvl>
+    <w:lvl w:ilvl="1">
+      <w:start w:val="1"/>
+      <w:numFmt w:val="bullet"/>
+      <w:lvlText w:val="○"/>
+      <w:lvlJc w:val="left"/>
+      <w:pPr>
+        <w:ind w:left="1440" w:hanging="360"/>
+      </w:pPr>
+      <w:rPr>
+        <w:u w:val="none"/>
+      </w:rPr>
+    </w:lvl>
+    <w:lvl w:ilvl="2">
+      <w:start w:val="1"/>
+      <w:numFmt w:val="bullet"/>
+      <w:lvlText w:val="■"/>
+      <w:lvlJc w:val="left"/>
+      <w:pPr>
+        <w:ind w:left="2160" w:hanging="360"/>
+      </w:pPr>
+      <w:rPr>
+        <w:u w:val="none"/>
+      </w:rPr>
+    </w:lvl>
+    <w:lvl w:ilvl="3">
+      <w:start w:val="1"/>
+      <w:numFmt w:val="bullet"/>
+      <w:lvlText w:val="●"/>
+      <w:lvlJc w:val="left"/>
+      <w:pPr>
+        <w:ind w:left="2880" w:hanging="360"/>
+      </w:pPr>
+      <w:rPr>
+        <w:u w:val="none"/>
+      </w:rPr>
+    </w:lvl>
+    <w:lvl w:ilvl="4">
+      <w:start w:val="1"/>
+      <w:numFmt w:val="bullet"/>
+      <w:lvlText w:val="○"/>
+      <w:lvlJc w:val="left"/>
+      <w:pPr>
+        <w:ind w:left="3600" w:hanging="360"/>
+      </w:pPr>
+      <w:rPr>
+        <w:u w:val="none"/>
+      </w:rPr>
+    </w:lvl>
+    <w:lvl w:ilvl="5">
+      <w:start w:val="1"/>
+      <w:numFmt w:val="bullet"/>
+      <w:lvlText w:val="■"/>
+      <w:lvlJc w:val="left"/>
+      <w:pPr>
+        <w:ind w:left="4320" w:hanging="360"/>
+      </w:pPr>
+      <w:rPr>
+        <w:u w:val="none"/>
+      </w:rPr>
+    </w:lvl>
+    <w:lvl w:ilvl="6">
+      <w:start w:val="1"/>
+      <w:numFmt w:val="bullet"/>
+      <w:lvlText w:val="●"/>
+      <w:lvlJc w:val="left"/>
+      <w:pPr>
+        <w:ind w:left="5040" w:hanging="360"/>
+      </w:pPr>
+      <w:rPr>
+        <w:u w:val="none"/>
+      </w:rPr>
+    </w:lvl>
+    <w:lvl w:ilvl="7">
+      <w:start w:val="1"/>
+      <w:numFmt w:val="bullet"/>
+      <w:lvlText w:val="○"/>
+      <w:lvlJc w:val="left"/>
+      <w:pPr>
+        <w:ind w:left="5760" w:hanging="360"/>
+      </w:pPr>
+      <w:rPr>
+        <w:u w:val="none"/>
+      </w:rPr>
+    </w:lvl>
+    <w:lvl w:ilvl="8">
+      <w:start w:val="1"/>
+      <w:numFmt w:val="bullet"/>
+      <w:lvlText w:val="■"/>
+      <w:lvlJc w:val="left"/>
+      <w:pPr>
+        <w:ind w:left="6480" w:hanging="360"/>
+      </w:pPr>
+      <w:rPr>
+        <w:u w:val="none"/>
+      </w:rPr>
+    </w:lvl>
+  </w:abstractNum>
+  <w:abstractNum w:abstractNumId="1" w15:restartNumberingAfterBreak="0">
+    <w:nsid w:val="66690D1A"/>
+    <w:multiLevelType w:val="multilevel"/>
+    <w:tmpl w:val="1062D750"/>
     <w:lvl w:ilvl="0">
       <w:start w:val="1"/>
       <w:numFmt w:val="decimal"/>
@@ -1780,7 +3309,10 @@
       </w:rPr>
     </w:lvl>
   </w:abstractNum>
-  <w:num w:numId="1" w16cid:durableId="1366440172">
+  <w:num w:numId="1" w16cid:durableId="1978491312">
+    <w:abstractNumId w:val="1"/>
+  </w:num>
+  <w:num w:numId="2" w16cid:durableId="1516578836">
     <w:abstractNumId w:val="0"/>
   </w:num>
 </w:numbering>
@@ -2302,7 +3834,6 @@
   <w:style w:type="character" w:default="1" w:styleId="DefaultParagraphFont">
     <w:name w:val="Default Paragraph Font"/>
     <w:uiPriority w:val="1"/>
-    <w:semiHidden/>
     <w:unhideWhenUsed/>
   </w:style>
   <w:style w:type="table" w:default="1" w:styleId="TableNormal">
@@ -2370,6 +3901,29 @@
       <w:szCs w:val="30"/>
     </w:rPr>
   </w:style>
+  <w:style w:type="character" w:styleId="Hyperlink">
+    <w:name w:val="Hyperlink"/>
+    <w:basedOn w:val="DefaultParagraphFont"/>
+    <w:uiPriority w:val="99"/>
+    <w:unhideWhenUsed/>
+    <w:rsid w:val="00637929"/>
+    <w:rPr>
+      <w:color w:val="0000FF" w:themeColor="hyperlink"/>
+      <w:u w:val="single"/>
+    </w:rPr>
+  </w:style>
+  <w:style w:type="character" w:styleId="UnresolvedMention">
+    <w:name w:val="Unresolved Mention"/>
+    <w:basedOn w:val="DefaultParagraphFont"/>
+    <w:uiPriority w:val="99"/>
+    <w:semiHidden/>
+    <w:unhideWhenUsed/>
+    <w:rsid w:val="00637929"/>
+    <w:rPr>
+      <w:color w:val="605E5C"/>
+      <w:shd w:val="clear" w:color="auto" w:fill="E1DFDD"/>
+    </w:rPr>
+  </w:style>
   <w:style w:type="paragraph" w:styleId="TOCHeading">
     <w:name w:val="TOC Heading"/>
     <w:basedOn w:val="Heading1"/>
@@ -2377,7 +3931,7 @@
     <w:uiPriority w:val="39"/>
     <w:unhideWhenUsed/>
     <w:qFormat/>
-    <w:rsid w:val="009B2CB4"/>
+    <w:rsid w:val="00637929"/>
     <w:pPr>
       <w:spacing w:before="240" w:after="0" w:line="259" w:lineRule="auto"/>
       <w:outlineLvl w:val="9"/>
@@ -2397,21 +3951,10 @@
     <w:autoRedefine/>
     <w:uiPriority w:val="39"/>
     <w:unhideWhenUsed/>
-    <w:rsid w:val="009B2CB4"/>
+    <w:rsid w:val="00637929"/>
     <w:pPr>
       <w:spacing w:after="100"/>
     </w:pPr>
-  </w:style>
-  <w:style w:type="character" w:styleId="Hyperlink">
-    <w:name w:val="Hyperlink"/>
-    <w:basedOn w:val="DefaultParagraphFont"/>
-    <w:uiPriority w:val="99"/>
-    <w:unhideWhenUsed/>
-    <w:rsid w:val="009B2CB4"/>
-    <w:rPr>
-      <w:color w:val="0000FF" w:themeColor="hyperlink"/>
-      <w:u w:val="single"/>
-    </w:rPr>
   </w:style>
 </w:styles>
 </file>
@@ -2741,7 +4284,7 @@
 </file>
 
 <file path=customXml/itemProps1.xml><?xml version="1.0" encoding="utf-8"?>
-<ds:datastoreItem xmlns:ds="http://schemas.openxmlformats.org/officeDocument/2006/customXml" ds:itemID="{787D470B-0558-4FA2-8625-3C42918224FB}">
+<ds:datastoreItem xmlns:ds="http://schemas.openxmlformats.org/officeDocument/2006/customXml" ds:itemID="{718E0C8A-4D3F-4AB8-8904-3532680A2904}">
   <ds:schemaRefs>
     <ds:schemaRef ds:uri="http://schemas.openxmlformats.org/officeDocument/2006/bibliography"/>
   </ds:schemaRefs>

</xml_diff>